<commit_message>
docs:screenshots for argocd implementation
</commit_message>
<xml_diff>
--- a/docs/usermgmt_ci_cd_screenshots.docx
+++ b/docs/usermgmt_ci_cd_screenshots.docx
@@ -540,6 +540,9 @@
     </w:p>
     <w:p>
       <w:r>
+        <w:rPr>
+          <w:noProof/>
+        </w:rPr>
         <w:drawing>
           <wp:inline distT="0" distB="0" distL="0" distR="0" wp14:anchorId="291CDE87" wp14:editId="77E4F37E">
             <wp:extent cx="6451157" cy="2534285"/>
@@ -587,6 +590,9 @@
     </w:p>
     <w:p>
       <w:r>
+        <w:rPr>
+          <w:noProof/>
+        </w:rPr>
         <w:drawing>
           <wp:inline distT="0" distB="0" distL="0" distR="0" wp14:anchorId="0EC0BB89" wp14:editId="45E9C7A8">
             <wp:extent cx="5943600" cy="1557020"/>
@@ -649,6 +655,9 @@
     </w:p>
     <w:p>
       <w:r>
+        <w:rPr>
+          <w:noProof/>
+        </w:rPr>
         <w:lastRenderedPageBreak/>
         <w:drawing>
           <wp:inline distT="0" distB="0" distL="0" distR="0" wp14:anchorId="15891848" wp14:editId="6D4C9F71">
@@ -687,6 +696,355 @@
         </w:drawing>
       </w:r>
     </w:p>
+    <w:p>
+      <w:proofErr w:type="spellStart"/>
+      <w:r>
+        <w:t>ArgoCD</w:t>
+      </w:r>
+      <w:proofErr w:type="spellEnd"/>
+      <w:r>
+        <w:t xml:space="preserve"> healthy and in sync with the live state of the EKS cluster.</w:t>
+      </w:r>
+    </w:p>
+    <w:p>
+      <w:r>
+        <w:drawing>
+          <wp:inline distT="0" distB="0" distL="0" distR="0" wp14:anchorId="0E23F59C" wp14:editId="065DE9AE">
+            <wp:extent cx="5943600" cy="2610485"/>
+            <wp:effectExtent l="0" t="0" r="0" b="0"/>
+            <wp:docPr id="1143865554" name="Picture 1"/>
+            <wp:cNvGraphicFramePr>
+              <a:graphicFrameLocks xmlns:a="http://schemas.openxmlformats.org/drawingml/2006/main" noChangeAspect="1"/>
+            </wp:cNvGraphicFramePr>
+            <a:graphic xmlns:a="http://schemas.openxmlformats.org/drawingml/2006/main">
+              <a:graphicData uri="http://schemas.openxmlformats.org/drawingml/2006/picture">
+                <pic:pic xmlns:pic="http://schemas.openxmlformats.org/drawingml/2006/picture">
+                  <pic:nvPicPr>
+                    <pic:cNvPr id="1143865554" name=""/>
+                    <pic:cNvPicPr/>
+                  </pic:nvPicPr>
+                  <pic:blipFill>
+                    <a:blip r:embed="rId14"/>
+                    <a:stretch>
+                      <a:fillRect/>
+                    </a:stretch>
+                  </pic:blipFill>
+                  <pic:spPr>
+                    <a:xfrm>
+                      <a:off x="0" y="0"/>
+                      <a:ext cx="5943600" cy="2610485"/>
+                    </a:xfrm>
+                    <a:prstGeom prst="rect">
+                      <a:avLst/>
+                    </a:prstGeom>
+                  </pic:spPr>
+                </pic:pic>
+              </a:graphicData>
+            </a:graphic>
+          </wp:inline>
+        </w:drawing>
+      </w:r>
+    </w:p>
+    <w:p>
+      <w:r>
+        <w:lastRenderedPageBreak/>
+        <w:drawing>
+          <wp:inline distT="0" distB="0" distL="0" distR="0" wp14:anchorId="57C19FCF" wp14:editId="354AE5AB">
+            <wp:extent cx="5943600" cy="4878705"/>
+            <wp:effectExtent l="0" t="0" r="0" b="0"/>
+            <wp:docPr id="192772791" name="Picture 1"/>
+            <wp:cNvGraphicFramePr>
+              <a:graphicFrameLocks xmlns:a="http://schemas.openxmlformats.org/drawingml/2006/main" noChangeAspect="1"/>
+            </wp:cNvGraphicFramePr>
+            <a:graphic xmlns:a="http://schemas.openxmlformats.org/drawingml/2006/main">
+              <a:graphicData uri="http://schemas.openxmlformats.org/drawingml/2006/picture">
+                <pic:pic xmlns:pic="http://schemas.openxmlformats.org/drawingml/2006/picture">
+                  <pic:nvPicPr>
+                    <pic:cNvPr id="192772791" name=""/>
+                    <pic:cNvPicPr/>
+                  </pic:nvPicPr>
+                  <pic:blipFill>
+                    <a:blip r:embed="rId15"/>
+                    <a:stretch>
+                      <a:fillRect/>
+                    </a:stretch>
+                  </pic:blipFill>
+                  <pic:spPr>
+                    <a:xfrm>
+                      <a:off x="0" y="0"/>
+                      <a:ext cx="5943600" cy="4878705"/>
+                    </a:xfrm>
+                    <a:prstGeom prst="rect">
+                      <a:avLst/>
+                    </a:prstGeom>
+                  </pic:spPr>
+                </pic:pic>
+              </a:graphicData>
+            </a:graphic>
+          </wp:inline>
+        </w:drawing>
+      </w:r>
+    </w:p>
+    <w:p>
+      <w:r>
+        <w:drawing>
+          <wp:inline distT="0" distB="0" distL="0" distR="0" wp14:anchorId="1D7CA2C6" wp14:editId="4EE2C943">
+            <wp:extent cx="5943600" cy="2922270"/>
+            <wp:effectExtent l="0" t="0" r="0" b="0"/>
+            <wp:docPr id="321881242" name="Picture 1"/>
+            <wp:cNvGraphicFramePr>
+              <a:graphicFrameLocks xmlns:a="http://schemas.openxmlformats.org/drawingml/2006/main" noChangeAspect="1"/>
+            </wp:cNvGraphicFramePr>
+            <a:graphic xmlns:a="http://schemas.openxmlformats.org/drawingml/2006/main">
+              <a:graphicData uri="http://schemas.openxmlformats.org/drawingml/2006/picture">
+                <pic:pic xmlns:pic="http://schemas.openxmlformats.org/drawingml/2006/picture">
+                  <pic:nvPicPr>
+                    <pic:cNvPr id="321881242" name=""/>
+                    <pic:cNvPicPr/>
+                  </pic:nvPicPr>
+                  <pic:blipFill>
+                    <a:blip r:embed="rId16"/>
+                    <a:stretch>
+                      <a:fillRect/>
+                    </a:stretch>
+                  </pic:blipFill>
+                  <pic:spPr>
+                    <a:xfrm>
+                      <a:off x="0" y="0"/>
+                      <a:ext cx="5943600" cy="2922270"/>
+                    </a:xfrm>
+                    <a:prstGeom prst="rect">
+                      <a:avLst/>
+                    </a:prstGeom>
+                  </pic:spPr>
+                </pic:pic>
+              </a:graphicData>
+            </a:graphic>
+          </wp:inline>
+        </w:drawing>
+      </w:r>
+    </w:p>
+    <w:p>
+      <w:r>
+        <w:lastRenderedPageBreak/>
+        <w:drawing>
+          <wp:inline distT="0" distB="0" distL="0" distR="0" wp14:anchorId="3646E193" wp14:editId="4C2D37C5">
+            <wp:extent cx="5943600" cy="3275965"/>
+            <wp:effectExtent l="0" t="0" r="0" b="635"/>
+            <wp:docPr id="1108691878" name="Picture 1"/>
+            <wp:cNvGraphicFramePr>
+              <a:graphicFrameLocks xmlns:a="http://schemas.openxmlformats.org/drawingml/2006/main" noChangeAspect="1"/>
+            </wp:cNvGraphicFramePr>
+            <a:graphic xmlns:a="http://schemas.openxmlformats.org/drawingml/2006/main">
+              <a:graphicData uri="http://schemas.openxmlformats.org/drawingml/2006/picture">
+                <pic:pic xmlns:pic="http://schemas.openxmlformats.org/drawingml/2006/picture">
+                  <pic:nvPicPr>
+                    <pic:cNvPr id="1108691878" name=""/>
+                    <pic:cNvPicPr/>
+                  </pic:nvPicPr>
+                  <pic:blipFill>
+                    <a:blip r:embed="rId17"/>
+                    <a:stretch>
+                      <a:fillRect/>
+                    </a:stretch>
+                  </pic:blipFill>
+                  <pic:spPr>
+                    <a:xfrm>
+                      <a:off x="0" y="0"/>
+                      <a:ext cx="5943600" cy="3275965"/>
+                    </a:xfrm>
+                    <a:prstGeom prst="rect">
+                      <a:avLst/>
+                    </a:prstGeom>
+                  </pic:spPr>
+                </pic:pic>
+              </a:graphicData>
+            </a:graphic>
+          </wp:inline>
+        </w:drawing>
+      </w:r>
+    </w:p>
+    <w:p>
+      <w:pPr>
+        <w:rPr>
+          <w:b/>
+          <w:bCs/>
+        </w:rPr>
+      </w:pPr>
+      <w:r>
+        <w:rPr>
+          <w:rFonts w:ascii="Segoe UI Emoji" w:hAnsi="Segoe UI Emoji" w:cs="Segoe UI Emoji"/>
+          <w:b/>
+          <w:bCs/>
+        </w:rPr>
+        <w:t>✅</w:t>
+      </w:r>
+      <w:r>
+        <w:rPr>
+          <w:b/>
+          <w:bCs/>
+        </w:rPr>
+        <w:t xml:space="preserve"> </w:t>
+      </w:r>
+      <w:proofErr w:type="spellStart"/>
+      <w:r>
+        <w:rPr>
+          <w:b/>
+          <w:bCs/>
+        </w:rPr>
+        <w:t>GitOps</w:t>
+      </w:r>
+      <w:proofErr w:type="spellEnd"/>
+      <w:r>
+        <w:rPr>
+          <w:b/>
+          <w:bCs/>
+        </w:rPr>
+        <w:t xml:space="preserve"> Pipeline</w:t>
+      </w:r>
+    </w:p>
+    <w:p>
+      <w:r>
+        <w:t>Application Repo</w:t>
+      </w:r>
+      <w:r>
+        <w:br/>
+      </w:r>
+      <w:r>
+        <w:rPr>
+          <w:rFonts w:ascii="Segoe UI Emoji" w:hAnsi="Segoe UI Emoji" w:cs="Segoe UI Emoji"/>
+        </w:rPr>
+        <w:t>⬇️</w:t>
+      </w:r>
+    </w:p>
+    <w:p>
+      <w:r>
+        <w:t>Build Image</w:t>
+      </w:r>
+      <w:r>
+        <w:br/>
+      </w:r>
+      <w:r>
+        <w:rPr>
+          <w:rFonts w:ascii="Segoe UI Emoji" w:hAnsi="Segoe UI Emoji" w:cs="Segoe UI Emoji"/>
+        </w:rPr>
+        <w:t>⬇️</w:t>
+      </w:r>
+    </w:p>
+    <w:p>
+      <w:r>
+        <w:t>Push to ECR</w:t>
+      </w:r>
+      <w:r>
+        <w:br/>
+      </w:r>
+      <w:r>
+        <w:rPr>
+          <w:rFonts w:ascii="Segoe UI Emoji" w:hAnsi="Segoe UI Emoji" w:cs="Segoe UI Emoji"/>
+        </w:rPr>
+        <w:t>⬇️</w:t>
+      </w:r>
+    </w:p>
+    <w:p>
+      <w:r>
+        <w:t xml:space="preserve">Update </w:t>
+      </w:r>
+      <w:proofErr w:type="spellStart"/>
+      <w:r>
+        <w:t>GitOps</w:t>
+      </w:r>
+      <w:proofErr w:type="spellEnd"/>
+      <w:r>
+        <w:t xml:space="preserve"> repo (</w:t>
+      </w:r>
+      <w:proofErr w:type="spellStart"/>
+      <w:proofErr w:type="gramStart"/>
+      <w:r>
+        <w:t>values.yaml</w:t>
+      </w:r>
+      <w:proofErr w:type="spellEnd"/>
+      <w:proofErr w:type="gramEnd"/>
+      <w:r>
+        <w:t>)</w:t>
+      </w:r>
+      <w:r>
+        <w:br/>
+      </w:r>
+      <w:r>
+        <w:rPr>
+          <w:rFonts w:ascii="Segoe UI Emoji" w:hAnsi="Segoe UI Emoji" w:cs="Segoe UI Emoji"/>
+        </w:rPr>
+        <w:t>⬇️</w:t>
+      </w:r>
+    </w:p>
+    <w:p>
+      <w:r>
+        <w:t>Commit automatically</w:t>
+      </w:r>
+      <w:r>
+        <w:br/>
+      </w:r>
+      <w:r>
+        <w:rPr>
+          <w:rFonts w:ascii="Segoe UI Emoji" w:hAnsi="Segoe UI Emoji" w:cs="Segoe UI Emoji"/>
+        </w:rPr>
+        <w:t>⬇️</w:t>
+      </w:r>
+    </w:p>
+    <w:p>
+      <w:proofErr w:type="spellStart"/>
+      <w:r>
+        <w:t>ArgoCD</w:t>
+      </w:r>
+      <w:proofErr w:type="spellEnd"/>
+      <w:r>
+        <w:t xml:space="preserve"> detects commit</w:t>
+      </w:r>
+      <w:r>
+        <w:br/>
+      </w:r>
+      <w:r>
+        <w:rPr>
+          <w:rFonts w:ascii="Segoe UI Emoji" w:hAnsi="Segoe UI Emoji" w:cs="Segoe UI Emoji"/>
+        </w:rPr>
+        <w:t>⬇️</w:t>
+      </w:r>
+    </w:p>
+    <w:p>
+      <w:r>
+        <w:t>Helm renders manifests</w:t>
+      </w:r>
+      <w:r>
+        <w:br/>
+      </w:r>
+      <w:r>
+        <w:rPr>
+          <w:rFonts w:ascii="Segoe UI Emoji" w:hAnsi="Segoe UI Emoji" w:cs="Segoe UI Emoji"/>
+        </w:rPr>
+        <w:t>⬇️</w:t>
+      </w:r>
+    </w:p>
+    <w:p>
+      <w:r>
+        <w:t>Deployment rolls out</w:t>
+      </w:r>
+      <w:r>
+        <w:br/>
+      </w:r>
+      <w:r>
+        <w:rPr>
+          <w:rFonts w:ascii="Segoe UI Emoji" w:hAnsi="Segoe UI Emoji" w:cs="Segoe UI Emoji"/>
+        </w:rPr>
+        <w:t>⬇️</w:t>
+      </w:r>
+    </w:p>
+    <w:p>
+      <w:r>
+        <w:lastRenderedPageBreak/>
+        <w:t>Healthy</w:t>
+      </w:r>
+    </w:p>
+    <w:p/>
     <w:sectPr>
       <w:pgSz w:w="12240" w:h="15840"/>
       <w:pgMar w:top="1440" w:right="1440" w:bottom="1440" w:left="1440" w:header="720" w:footer="720" w:gutter="0"/>
@@ -1300,7 +1658,6 @@
   <w:style w:type="character" w:default="1" w:styleId="DefaultParagraphFont">
     <w:name w:val="Default Paragraph Font"/>
     <w:uiPriority w:val="1"/>
-    <w:semiHidden/>
     <w:unhideWhenUsed/>
   </w:style>
   <w:style w:type="table" w:default="1" w:styleId="TableNormal">

</xml_diff>

<commit_message>
feat(observability): enable ADOT metrics pipeline with AMP and Managed Grafana
- deploy OpenTelemetry metrics collector
- configure Prometheus Remote Write to AMP
- integrate Amazon Managed Grafana datasource
- validate Kubernetes cluster metrics
- enable workload and namespace dashboards
- fix collector pipeline configuration
</commit_message>
<xml_diff>
--- a/docs/usermgmt_ci_cd_screenshots.docx
+++ b/docs/usermgmt_ci_cd_screenshots.docx
@@ -708,6 +708,9 @@
     </w:p>
     <w:p>
       <w:r>
+        <w:rPr>
+          <w:noProof/>
+        </w:rPr>
         <w:drawing>
           <wp:inline distT="0" distB="0" distL="0" distR="0" wp14:anchorId="0E23F59C" wp14:editId="065DE9AE">
             <wp:extent cx="5943600" cy="2610485"/>
@@ -747,6 +750,9 @@
     </w:p>
     <w:p>
       <w:r>
+        <w:rPr>
+          <w:noProof/>
+        </w:rPr>
         <w:lastRenderedPageBreak/>
         <w:drawing>
           <wp:inline distT="0" distB="0" distL="0" distR="0" wp14:anchorId="57C19FCF" wp14:editId="354AE5AB">
@@ -787,6 +793,9 @@
     </w:p>
     <w:p>
       <w:r>
+        <w:rPr>
+          <w:noProof/>
+        </w:rPr>
         <w:drawing>
           <wp:inline distT="0" distB="0" distL="0" distR="0" wp14:anchorId="1D7CA2C6" wp14:editId="4EE2C943">
             <wp:extent cx="5943600" cy="2922270"/>
@@ -825,7 +834,18 @@
       </w:r>
     </w:p>
     <w:p>
-      <w:r>
+      <w:pPr>
+        <w:rPr>
+          <w:b/>
+          <w:bCs/>
+        </w:rPr>
+      </w:pPr>
+      <w:r>
+        <w:rPr>
+          <w:b/>
+          <w:bCs/>
+          <w:noProof/>
+        </w:rPr>
         <w:lastRenderedPageBreak/>
         <w:drawing>
           <wp:inline distT="0" distB="0" distL="0" distR="0" wp14:anchorId="3646E193" wp14:editId="4C2D37C5">
@@ -871,6 +891,299 @@
           <w:bCs/>
         </w:rPr>
       </w:pPr>
+      <w:proofErr w:type="spellStart"/>
+      <w:r>
+        <w:rPr>
+          <w:b/>
+          <w:bCs/>
+          <w:highlight w:val="yellow"/>
+        </w:rPr>
+        <w:t>adot_metrics</w:t>
+      </w:r>
+      <w:proofErr w:type="spellEnd"/>
+      <w:r>
+        <w:rPr>
+          <w:b/>
+          <w:bCs/>
+          <w:highlight w:val="yellow"/>
+        </w:rPr>
+        <w:t xml:space="preserve"> implementation</w:t>
+      </w:r>
+    </w:p>
+    <w:p>
+      <w:r>
+        <w:t xml:space="preserve">- deploy </w:t>
+      </w:r>
+      <w:proofErr w:type="spellStart"/>
+      <w:r>
+        <w:t>OpenTelemetry</w:t>
+      </w:r>
+      <w:proofErr w:type="spellEnd"/>
+      <w:r>
+        <w:t xml:space="preserve"> metrics collector</w:t>
+      </w:r>
+    </w:p>
+    <w:p>
+      <w:r>
+        <w:t>- configure Prometheus Remote Write to AMP</w:t>
+      </w:r>
+    </w:p>
+    <w:p>
+      <w:r>
+        <w:t xml:space="preserve">- integrate Amazon Managed Grafana </w:t>
+      </w:r>
+      <w:proofErr w:type="spellStart"/>
+      <w:r>
+        <w:t>datasource</w:t>
+      </w:r>
+      <w:proofErr w:type="spellEnd"/>
+    </w:p>
+    <w:p>
+      <w:r>
+        <w:t>- validate Kubernetes cluster metrics</w:t>
+      </w:r>
+    </w:p>
+    <w:p>
+      <w:r>
+        <w:t>- enable workload and namespace dashboards</w:t>
+      </w:r>
+    </w:p>
+    <w:p>
+      <w:r>
+        <w:t>- fix collector pipeline configuration"</w:t>
+      </w:r>
+    </w:p>
+    <w:p>
+      <w:r>
+        <w:drawing>
+          <wp:inline distT="0" distB="0" distL="0" distR="0" wp14:anchorId="479FDF9B" wp14:editId="61CC24D0">
+            <wp:extent cx="5943600" cy="2212975"/>
+            <wp:effectExtent l="0" t="0" r="0" b="0"/>
+            <wp:docPr id="1802997011" name="Picture 1"/>
+            <wp:cNvGraphicFramePr>
+              <a:graphicFrameLocks xmlns:a="http://schemas.openxmlformats.org/drawingml/2006/main" noChangeAspect="1"/>
+            </wp:cNvGraphicFramePr>
+            <a:graphic xmlns:a="http://schemas.openxmlformats.org/drawingml/2006/main">
+              <a:graphicData uri="http://schemas.openxmlformats.org/drawingml/2006/picture">
+                <pic:pic xmlns:pic="http://schemas.openxmlformats.org/drawingml/2006/picture">
+                  <pic:nvPicPr>
+                    <pic:cNvPr id="1802997011" name=""/>
+                    <pic:cNvPicPr/>
+                  </pic:nvPicPr>
+                  <pic:blipFill>
+                    <a:blip r:embed="rId18"/>
+                    <a:stretch>
+                      <a:fillRect/>
+                    </a:stretch>
+                  </pic:blipFill>
+                  <pic:spPr>
+                    <a:xfrm>
+                      <a:off x="0" y="0"/>
+                      <a:ext cx="5943600" cy="2212975"/>
+                    </a:xfrm>
+                    <a:prstGeom prst="rect">
+                      <a:avLst/>
+                    </a:prstGeom>
+                  </pic:spPr>
+                </pic:pic>
+              </a:graphicData>
+            </a:graphic>
+          </wp:inline>
+        </w:drawing>
+      </w:r>
+    </w:p>
+    <w:p>
+      <w:r>
+        <w:lastRenderedPageBreak/>
+        <w:drawing>
+          <wp:inline distT="0" distB="0" distL="0" distR="0" wp14:anchorId="5FAFF5D1" wp14:editId="172E7FCF">
+            <wp:extent cx="5943600" cy="2740025"/>
+            <wp:effectExtent l="0" t="0" r="0" b="3175"/>
+            <wp:docPr id="2053764645" name="Picture 1"/>
+            <wp:cNvGraphicFramePr>
+              <a:graphicFrameLocks xmlns:a="http://schemas.openxmlformats.org/drawingml/2006/main" noChangeAspect="1"/>
+            </wp:cNvGraphicFramePr>
+            <a:graphic xmlns:a="http://schemas.openxmlformats.org/drawingml/2006/main">
+              <a:graphicData uri="http://schemas.openxmlformats.org/drawingml/2006/picture">
+                <pic:pic xmlns:pic="http://schemas.openxmlformats.org/drawingml/2006/picture">
+                  <pic:nvPicPr>
+                    <pic:cNvPr id="2053764645" name=""/>
+                    <pic:cNvPicPr/>
+                  </pic:nvPicPr>
+                  <pic:blipFill>
+                    <a:blip r:embed="rId19"/>
+                    <a:stretch>
+                      <a:fillRect/>
+                    </a:stretch>
+                  </pic:blipFill>
+                  <pic:spPr>
+                    <a:xfrm>
+                      <a:off x="0" y="0"/>
+                      <a:ext cx="5943600" cy="2740025"/>
+                    </a:xfrm>
+                    <a:prstGeom prst="rect">
+                      <a:avLst/>
+                    </a:prstGeom>
+                  </pic:spPr>
+                </pic:pic>
+              </a:graphicData>
+            </a:graphic>
+          </wp:inline>
+        </w:drawing>
+      </w:r>
+    </w:p>
+    <w:p>
+      <w:r>
+        <w:rPr>
+          <w:highlight w:val="yellow"/>
+        </w:rPr>
+        <w:t>Grafana</w:t>
+      </w:r>
+      <w:r>
+        <w:rPr>
+          <w:highlight w:val="yellow"/>
+        </w:rPr>
+        <w:t>/</w:t>
+      </w:r>
+      <w:proofErr w:type="gramStart"/>
+      <w:r>
+        <w:rPr>
+          <w:highlight w:val="yellow"/>
+        </w:rPr>
+        <w:t xml:space="preserve">Prometheus </w:t>
+      </w:r>
+      <w:r>
+        <w:rPr>
+          <w:highlight w:val="yellow"/>
+        </w:rPr>
+        <w:t xml:space="preserve"> dashboard</w:t>
+      </w:r>
+      <w:proofErr w:type="gramEnd"/>
+      <w:r>
+        <w:rPr>
+          <w:highlight w:val="yellow"/>
+        </w:rPr>
+        <w:t xml:space="preserve"> for </w:t>
+      </w:r>
+      <w:proofErr w:type="spellStart"/>
+      <w:r>
+        <w:rPr>
+          <w:highlight w:val="yellow"/>
+        </w:rPr>
+        <w:t>usermgmt</w:t>
+      </w:r>
+      <w:proofErr w:type="spellEnd"/>
+      <w:r>
+        <w:rPr>
+          <w:highlight w:val="yellow"/>
+        </w:rPr>
+        <w:t xml:space="preserve"> service</w:t>
+      </w:r>
+    </w:p>
+    <w:p>
+      <w:r>
+        <w:drawing>
+          <wp:inline distT="0" distB="0" distL="0" distR="0" wp14:anchorId="469A4CF6" wp14:editId="00FB649D">
+            <wp:extent cx="5943600" cy="2310130"/>
+            <wp:effectExtent l="0" t="0" r="0" b="0"/>
+            <wp:docPr id="1387133531" name="Picture 1"/>
+            <wp:cNvGraphicFramePr>
+              <a:graphicFrameLocks xmlns:a="http://schemas.openxmlformats.org/drawingml/2006/main" noChangeAspect="1"/>
+            </wp:cNvGraphicFramePr>
+            <a:graphic xmlns:a="http://schemas.openxmlformats.org/drawingml/2006/main">
+              <a:graphicData uri="http://schemas.openxmlformats.org/drawingml/2006/picture">
+                <pic:pic xmlns:pic="http://schemas.openxmlformats.org/drawingml/2006/picture">
+                  <pic:nvPicPr>
+                    <pic:cNvPr id="1387133531" name=""/>
+                    <pic:cNvPicPr/>
+                  </pic:nvPicPr>
+                  <pic:blipFill>
+                    <a:blip r:embed="rId20"/>
+                    <a:stretch>
+                      <a:fillRect/>
+                    </a:stretch>
+                  </pic:blipFill>
+                  <pic:spPr>
+                    <a:xfrm>
+                      <a:off x="0" y="0"/>
+                      <a:ext cx="5943600" cy="2310130"/>
+                    </a:xfrm>
+                    <a:prstGeom prst="rect">
+                      <a:avLst/>
+                    </a:prstGeom>
+                  </pic:spPr>
+                </pic:pic>
+              </a:graphicData>
+            </a:graphic>
+          </wp:inline>
+        </w:drawing>
+      </w:r>
+    </w:p>
+    <w:p>
+      <w:r>
+        <w:drawing>
+          <wp:inline distT="0" distB="0" distL="0" distR="0" wp14:anchorId="26A6B457" wp14:editId="39513E38">
+            <wp:extent cx="5943600" cy="2094865"/>
+            <wp:effectExtent l="0" t="0" r="0" b="635"/>
+            <wp:docPr id="905399130" name="Picture 1"/>
+            <wp:cNvGraphicFramePr>
+              <a:graphicFrameLocks xmlns:a="http://schemas.openxmlformats.org/drawingml/2006/main" noChangeAspect="1"/>
+            </wp:cNvGraphicFramePr>
+            <a:graphic xmlns:a="http://schemas.openxmlformats.org/drawingml/2006/main">
+              <a:graphicData uri="http://schemas.openxmlformats.org/drawingml/2006/picture">
+                <pic:pic xmlns:pic="http://schemas.openxmlformats.org/drawingml/2006/picture">
+                  <pic:nvPicPr>
+                    <pic:cNvPr id="905399130" name=""/>
+                    <pic:cNvPicPr/>
+                  </pic:nvPicPr>
+                  <pic:blipFill>
+                    <a:blip r:embed="rId21"/>
+                    <a:stretch>
+                      <a:fillRect/>
+                    </a:stretch>
+                  </pic:blipFill>
+                  <pic:spPr>
+                    <a:xfrm>
+                      <a:off x="0" y="0"/>
+                      <a:ext cx="5943600" cy="2094865"/>
+                    </a:xfrm>
+                    <a:prstGeom prst="rect">
+                      <a:avLst/>
+                    </a:prstGeom>
+                  </pic:spPr>
+                </pic:pic>
+              </a:graphicData>
+            </a:graphic>
+          </wp:inline>
+        </w:drawing>
+      </w:r>
+    </w:p>
+    <w:p/>
+    <w:p/>
+    <w:p/>
+    <w:p/>
+    <w:p/>
+    <w:p/>
+    <w:p/>
+    <w:p/>
+    <w:p/>
+    <w:p/>
+    <w:p/>
+    <w:p/>
+    <w:p/>
+    <w:p/>
+    <w:p/>
+    <w:p/>
+    <w:p/>
+    <w:p/>
+    <w:p/>
+    <w:p>
+      <w:pPr>
+        <w:rPr>
+          <w:b/>
+          <w:bCs/>
+        </w:rPr>
+      </w:pPr>
       <w:r>
         <w:rPr>
           <w:rFonts w:ascii="Segoe UI Emoji" w:hAnsi="Segoe UI Emoji" w:cs="Segoe UI Emoji"/>
@@ -979,6 +1292,7 @@
     </w:p>
     <w:p>
       <w:r>
+        <w:lastRenderedPageBreak/>
         <w:t>Commit automatically</w:t>
       </w:r>
       <w:r>
@@ -1040,7 +1354,6 @@
     </w:p>
     <w:p>
       <w:r>
-        <w:lastRenderedPageBreak/>
         <w:t>Healthy</w:t>
       </w:r>
     </w:p>
@@ -1658,6 +1971,7 @@
   <w:style w:type="character" w:default="1" w:styleId="DefaultParagraphFont">
     <w:name w:val="Default Paragraph Font"/>
     <w:uiPriority w:val="1"/>
+    <w:semiHidden/>
     <w:unhideWhenUsed/>
   </w:style>
   <w:style w:type="table" w:default="1" w:styleId="TableNormal">

</xml_diff>

<commit_message>
docs:screenshots for migrating usermgmt deployment to argo rollouts
</commit_message>
<xml_diff>
--- a/docs/usermgmt_ci_cd_screenshots.docx
+++ b/docs/usermgmt_ci_cd_screenshots.docx
@@ -34,6 +34,193 @@
       </w:r>
     </w:p>
     <w:p>
+      <w:pPr>
+        <w:rPr>
+          <w:b/>
+          <w:bCs/>
+        </w:rPr>
+      </w:pPr>
+      <w:r>
+        <w:rPr>
+          <w:rFonts w:ascii="Segoe UI Emoji" w:hAnsi="Segoe UI Emoji" w:cs="Segoe UI Emoji"/>
+          <w:b/>
+          <w:bCs/>
+        </w:rPr>
+        <w:t>✅</w:t>
+      </w:r>
+      <w:r>
+        <w:rPr>
+          <w:b/>
+          <w:bCs/>
+        </w:rPr>
+        <w:t xml:space="preserve"> </w:t>
+      </w:r>
+      <w:proofErr w:type="spellStart"/>
+      <w:r>
+        <w:rPr>
+          <w:b/>
+          <w:bCs/>
+        </w:rPr>
+        <w:t>GitOps</w:t>
+      </w:r>
+      <w:proofErr w:type="spellEnd"/>
+      <w:r>
+        <w:rPr>
+          <w:b/>
+          <w:bCs/>
+        </w:rPr>
+        <w:t xml:space="preserve"> Pipeline</w:t>
+      </w:r>
+    </w:p>
+    <w:p>
+      <w:r>
+        <w:t>Application Repo</w:t>
+      </w:r>
+      <w:r>
+        <w:br/>
+      </w:r>
+      <w:r>
+        <w:rPr>
+          <w:rFonts w:ascii="Segoe UI Emoji" w:hAnsi="Segoe UI Emoji" w:cs="Segoe UI Emoji"/>
+        </w:rPr>
+        <w:t>⬇️</w:t>
+      </w:r>
+    </w:p>
+    <w:p>
+      <w:r>
+        <w:t>Build Image</w:t>
+      </w:r>
+      <w:r>
+        <w:br/>
+      </w:r>
+      <w:r>
+        <w:rPr>
+          <w:rFonts w:ascii="Segoe UI Emoji" w:hAnsi="Segoe UI Emoji" w:cs="Segoe UI Emoji"/>
+        </w:rPr>
+        <w:t>⬇️</w:t>
+      </w:r>
+    </w:p>
+    <w:p>
+      <w:r>
+        <w:t>Push to ECR</w:t>
+      </w:r>
+      <w:r>
+        <w:br/>
+      </w:r>
+      <w:r>
+        <w:rPr>
+          <w:rFonts w:ascii="Segoe UI Emoji" w:hAnsi="Segoe UI Emoji" w:cs="Segoe UI Emoji"/>
+        </w:rPr>
+        <w:t>⬇️</w:t>
+      </w:r>
+    </w:p>
+    <w:p>
+      <w:r>
+        <w:t xml:space="preserve">Update </w:t>
+      </w:r>
+      <w:proofErr w:type="spellStart"/>
+      <w:r>
+        <w:t>GitOps</w:t>
+      </w:r>
+      <w:proofErr w:type="spellEnd"/>
+      <w:r>
+        <w:t xml:space="preserve"> repo (</w:t>
+      </w:r>
+      <w:proofErr w:type="spellStart"/>
+      <w:proofErr w:type="gramStart"/>
+      <w:r>
+        <w:t>values.yaml</w:t>
+      </w:r>
+      <w:proofErr w:type="spellEnd"/>
+      <w:proofErr w:type="gramEnd"/>
+      <w:r>
+        <w:t>)</w:t>
+      </w:r>
+      <w:r>
+        <w:br/>
+      </w:r>
+      <w:r>
+        <w:rPr>
+          <w:rFonts w:ascii="Segoe UI Emoji" w:hAnsi="Segoe UI Emoji" w:cs="Segoe UI Emoji"/>
+        </w:rPr>
+        <w:t>⬇️</w:t>
+      </w:r>
+    </w:p>
+    <w:p>
+      <w:r>
+        <w:t>Commit automatically</w:t>
+      </w:r>
+      <w:r>
+        <w:br/>
+      </w:r>
+      <w:r>
+        <w:rPr>
+          <w:rFonts w:ascii="Segoe UI Emoji" w:hAnsi="Segoe UI Emoji" w:cs="Segoe UI Emoji"/>
+        </w:rPr>
+        <w:t>⬇️</w:t>
+      </w:r>
+    </w:p>
+    <w:p>
+      <w:proofErr w:type="spellStart"/>
+      <w:r>
+        <w:t>ArgoCD</w:t>
+      </w:r>
+      <w:proofErr w:type="spellEnd"/>
+      <w:r>
+        <w:t xml:space="preserve"> detects commit</w:t>
+      </w:r>
+      <w:r>
+        <w:br/>
+      </w:r>
+      <w:r>
+        <w:rPr>
+          <w:rFonts w:ascii="Segoe UI Emoji" w:hAnsi="Segoe UI Emoji" w:cs="Segoe UI Emoji"/>
+        </w:rPr>
+        <w:t>⬇️</w:t>
+      </w:r>
+    </w:p>
+    <w:p>
+      <w:r>
+        <w:t>Helm renders manifests</w:t>
+      </w:r>
+      <w:r>
+        <w:br/>
+      </w:r>
+      <w:r>
+        <w:rPr>
+          <w:rFonts w:ascii="Segoe UI Emoji" w:hAnsi="Segoe UI Emoji" w:cs="Segoe UI Emoji"/>
+        </w:rPr>
+        <w:t>⬇️</w:t>
+      </w:r>
+    </w:p>
+    <w:p>
+      <w:r>
+        <w:t>Deployment rolls out</w:t>
+      </w:r>
+      <w:r>
+        <w:br/>
+      </w:r>
+      <w:r>
+        <w:rPr>
+          <w:rFonts w:ascii="Segoe UI Emoji" w:hAnsi="Segoe UI Emoji" w:cs="Segoe UI Emoji"/>
+        </w:rPr>
+        <w:t>⬇️</w:t>
+      </w:r>
+    </w:p>
+    <w:p>
+      <w:r>
+        <w:t>Healthy</w:t>
+      </w:r>
+    </w:p>
+    <w:p>
+      <w:pPr>
+        <w:rPr>
+          <w:b/>
+          <w:bCs/>
+        </w:rPr>
+      </w:pPr>
+    </w:p>
+    <w:p>
       <w:r>
         <w:t xml:space="preserve">1. </w:t>
       </w:r>
@@ -60,10 +247,7 @@
     </w:p>
     <w:p>
       <w:r>
-        <w:t>I</w:t>
-      </w:r>
-      <w:r>
-        <w:t>nstall Argo CD with Helm, ALB ingress, and CLI access</w:t>
+        <w:t>Install Argo CD with Helm, ALB ingress, and CLI access</w:t>
       </w:r>
     </w:p>
     <w:p>
@@ -71,6 +255,7 @@
         <w:rPr>
           <w:noProof/>
         </w:rPr>
+        <w:lastRenderedPageBreak/>
         <w:drawing>
           <wp:inline distT="0" distB="0" distL="0" distR="0" wp14:anchorId="6B3EE0F7" wp14:editId="1DC8D932">
             <wp:extent cx="5943600" cy="5264150"/>
@@ -632,23 +817,16 @@
     </w:p>
     <w:p>
       <w:proofErr w:type="spellStart"/>
-      <w:proofErr w:type="gramStart"/>
       <w:r>
         <w:t>GitOps</w:t>
       </w:r>
       <w:proofErr w:type="spellEnd"/>
       <w:r>
-        <w:t xml:space="preserve"> repo</w:t>
-      </w:r>
-      <w:proofErr w:type="gramEnd"/>
-      <w:r>
-        <w:t xml:space="preserve"> updated with latest </w:t>
-      </w:r>
-      <w:proofErr w:type="spellStart"/>
-      <w:r>
-        <w:t>imgae</w:t>
-      </w:r>
-      <w:proofErr w:type="spellEnd"/>
+        <w:t xml:space="preserve"> repo updated with latest </w:t>
+      </w:r>
+      <w:r>
+        <w:t>image</w:t>
+      </w:r>
       <w:r>
         <w:t xml:space="preserve"> tag</w:t>
       </w:r>
@@ -955,6 +1133,9 @@
     </w:p>
     <w:p>
       <w:r>
+        <w:rPr>
+          <w:noProof/>
+        </w:rPr>
         <w:drawing>
           <wp:inline distT="0" distB="0" distL="0" distR="0" wp14:anchorId="479FDF9B" wp14:editId="61CC24D0">
             <wp:extent cx="5943600" cy="2212975"/>
@@ -994,6 +1175,9 @@
     </w:p>
     <w:p>
       <w:r>
+        <w:rPr>
+          <w:noProof/>
+        </w:rPr>
         <w:lastRenderedPageBreak/>
         <w:drawing>
           <wp:inline distT="0" distB="0" distL="0" distR="0" wp14:anchorId="5FAFF5D1" wp14:editId="172E7FCF">
@@ -1082,6 +1266,9 @@
     </w:p>
     <w:p>
       <w:r>
+        <w:rPr>
+          <w:noProof/>
+        </w:rPr>
         <w:drawing>
           <wp:inline distT="0" distB="0" distL="0" distR="0" wp14:anchorId="469A4CF6" wp14:editId="00FB649D">
             <wp:extent cx="5943600" cy="2310130"/>
@@ -1121,6 +1308,9 @@
     </w:p>
     <w:p>
       <w:r>
+        <w:rPr>
+          <w:noProof/>
+        </w:rPr>
         <w:drawing>
           <wp:inline distT="0" distB="0" distL="0" distR="0" wp14:anchorId="26A6B457" wp14:editId="39513E38">
             <wp:extent cx="5943600" cy="2094865"/>
@@ -1159,204 +1349,625 @@
       </w:r>
     </w:p>
     <w:p/>
+    <w:p>
+      <w:pPr>
+        <w:rPr>
+          <w:b/>
+          <w:bCs/>
+          <w:sz w:val="20"/>
+          <w:szCs w:val="20"/>
+        </w:rPr>
+      </w:pPr>
+      <w:hyperlink r:id="rId22" w:tooltip="feat(platform): migrate User Management to Argo Rollouts" w:history="1">
+        <w:r>
+          <w:rPr>
+            <w:rStyle w:val="Hyperlink"/>
+            <w:b/>
+            <w:bCs/>
+            <w:sz w:val="20"/>
+            <w:szCs w:val="20"/>
+          </w:rPr>
+          <w:t xml:space="preserve">feat(platform): </w:t>
+        </w:r>
+        <w:proofErr w:type="gramStart"/>
+        <w:r>
+          <w:rPr>
+            <w:rStyle w:val="Hyperlink"/>
+            <w:b/>
+            <w:bCs/>
+            <w:sz w:val="20"/>
+            <w:szCs w:val="20"/>
+          </w:rPr>
+          <w:t>migrate</w:t>
+        </w:r>
+        <w:proofErr w:type="gramEnd"/>
+        <w:r>
+          <w:rPr>
+            <w:rStyle w:val="Hyperlink"/>
+            <w:b/>
+            <w:bCs/>
+            <w:sz w:val="20"/>
+            <w:szCs w:val="20"/>
+          </w:rPr>
+          <w:t xml:space="preserve"> User Management to Argo Rollouts</w:t>
+        </w:r>
+      </w:hyperlink>
+    </w:p>
+    <w:p>
+      <w:pPr>
+        <w:rPr>
+          <w:b/>
+          <w:bCs/>
+          <w:sz w:val="20"/>
+          <w:szCs w:val="20"/>
+        </w:rPr>
+      </w:pPr>
+      <w:proofErr w:type="spellStart"/>
+      <w:r>
+        <w:rPr>
+          <w:b/>
+          <w:bCs/>
+          <w:sz w:val="20"/>
+          <w:szCs w:val="20"/>
+          <w:highlight w:val="yellow"/>
+        </w:rPr>
+        <w:t>ArgoCD</w:t>
+      </w:r>
+      <w:proofErr w:type="spellEnd"/>
+      <w:r>
+        <w:rPr>
+          <w:b/>
+          <w:bCs/>
+          <w:sz w:val="20"/>
+          <w:szCs w:val="20"/>
+          <w:highlight w:val="yellow"/>
+        </w:rPr>
+        <w:t xml:space="preserve"> Rollouts-Canary</w:t>
+      </w:r>
+    </w:p>
+    <w:p>
+      <w:pPr>
+        <w:rPr>
+          <w:sz w:val="20"/>
+          <w:szCs w:val="20"/>
+        </w:rPr>
+      </w:pPr>
+      <w:r>
+        <w:rPr>
+          <w:sz w:val="20"/>
+          <w:szCs w:val="20"/>
+        </w:rPr>
+        <w:t>Feature Branch</w:t>
+      </w:r>
+    </w:p>
+    <w:p>
+      <w:pPr>
+        <w:rPr>
+          <w:sz w:val="20"/>
+          <w:szCs w:val="20"/>
+        </w:rPr>
+      </w:pPr>
+      <w:r>
+        <w:rPr>
+          <w:sz w:val="20"/>
+          <w:szCs w:val="20"/>
+        </w:rPr>
+        <w:t xml:space="preserve">        │</w:t>
+      </w:r>
+    </w:p>
+    <w:p>
+      <w:pPr>
+        <w:rPr>
+          <w:sz w:val="20"/>
+          <w:szCs w:val="20"/>
+        </w:rPr>
+      </w:pPr>
+      <w:r>
+        <w:rPr>
+          <w:sz w:val="20"/>
+          <w:szCs w:val="20"/>
+        </w:rPr>
+        <w:t xml:space="preserve">        </w:t>
+      </w:r>
+      <w:r>
+        <w:rPr>
+          <w:rFonts w:ascii="Arial" w:hAnsi="Arial" w:cs="Arial"/>
+          <w:sz w:val="20"/>
+          <w:szCs w:val="20"/>
+        </w:rPr>
+        <w:t>▼</w:t>
+      </w:r>
+    </w:p>
+    <w:p>
+      <w:pPr>
+        <w:rPr>
+          <w:sz w:val="20"/>
+          <w:szCs w:val="20"/>
+        </w:rPr>
+      </w:pPr>
+      <w:r>
+        <w:rPr>
+          <w:sz w:val="20"/>
+          <w:szCs w:val="20"/>
+        </w:rPr>
+        <w:t>Helm Validation</w:t>
+      </w:r>
+    </w:p>
+    <w:p>
+      <w:pPr>
+        <w:rPr>
+          <w:sz w:val="20"/>
+          <w:szCs w:val="20"/>
+        </w:rPr>
+      </w:pPr>
+      <w:r>
+        <w:rPr>
+          <w:sz w:val="20"/>
+          <w:szCs w:val="20"/>
+        </w:rPr>
+        <w:t xml:space="preserve">        │</w:t>
+      </w:r>
+    </w:p>
+    <w:p>
+      <w:pPr>
+        <w:rPr>
+          <w:sz w:val="20"/>
+          <w:szCs w:val="20"/>
+        </w:rPr>
+      </w:pPr>
+      <w:r>
+        <w:rPr>
+          <w:sz w:val="20"/>
+          <w:szCs w:val="20"/>
+        </w:rPr>
+        <w:t xml:space="preserve">        </w:t>
+      </w:r>
+      <w:r>
+        <w:rPr>
+          <w:rFonts w:ascii="Arial" w:hAnsi="Arial" w:cs="Arial"/>
+          <w:sz w:val="20"/>
+          <w:szCs w:val="20"/>
+        </w:rPr>
+        <w:t>▼</w:t>
+      </w:r>
+    </w:p>
+    <w:p>
+      <w:pPr>
+        <w:rPr>
+          <w:sz w:val="20"/>
+          <w:szCs w:val="20"/>
+        </w:rPr>
+      </w:pPr>
+      <w:r>
+        <w:rPr>
+          <w:sz w:val="20"/>
+          <w:szCs w:val="20"/>
+        </w:rPr>
+        <w:t>Git Commit</w:t>
+      </w:r>
+    </w:p>
+    <w:p>
+      <w:pPr>
+        <w:rPr>
+          <w:sz w:val="20"/>
+          <w:szCs w:val="20"/>
+        </w:rPr>
+      </w:pPr>
+      <w:r>
+        <w:rPr>
+          <w:sz w:val="20"/>
+          <w:szCs w:val="20"/>
+        </w:rPr>
+        <w:t xml:space="preserve">        │</w:t>
+      </w:r>
+    </w:p>
+    <w:p>
+      <w:pPr>
+        <w:rPr>
+          <w:sz w:val="20"/>
+          <w:szCs w:val="20"/>
+        </w:rPr>
+      </w:pPr>
+      <w:r>
+        <w:rPr>
+          <w:sz w:val="20"/>
+          <w:szCs w:val="20"/>
+        </w:rPr>
+        <w:t xml:space="preserve">        </w:t>
+      </w:r>
+      <w:r>
+        <w:rPr>
+          <w:rFonts w:ascii="Arial" w:hAnsi="Arial" w:cs="Arial"/>
+          <w:sz w:val="20"/>
+          <w:szCs w:val="20"/>
+        </w:rPr>
+        <w:t>▼</w:t>
+      </w:r>
+    </w:p>
+    <w:p>
+      <w:pPr>
+        <w:rPr>
+          <w:sz w:val="20"/>
+          <w:szCs w:val="20"/>
+        </w:rPr>
+      </w:pPr>
+      <w:r>
+        <w:rPr>
+          <w:sz w:val="20"/>
+          <w:szCs w:val="20"/>
+        </w:rPr>
+        <w:t>Merge to Main</w:t>
+      </w:r>
+    </w:p>
+    <w:p>
+      <w:pPr>
+        <w:rPr>
+          <w:sz w:val="20"/>
+          <w:szCs w:val="20"/>
+        </w:rPr>
+      </w:pPr>
+      <w:r>
+        <w:rPr>
+          <w:sz w:val="20"/>
+          <w:szCs w:val="20"/>
+        </w:rPr>
+        <w:t xml:space="preserve">        │</w:t>
+      </w:r>
+    </w:p>
+    <w:p>
+      <w:pPr>
+        <w:rPr>
+          <w:sz w:val="20"/>
+          <w:szCs w:val="20"/>
+        </w:rPr>
+      </w:pPr>
+      <w:r>
+        <w:rPr>
+          <w:sz w:val="20"/>
+          <w:szCs w:val="20"/>
+        </w:rPr>
+        <w:t xml:space="preserve">        </w:t>
+      </w:r>
+      <w:r>
+        <w:rPr>
+          <w:rFonts w:ascii="Arial" w:hAnsi="Arial" w:cs="Arial"/>
+          <w:sz w:val="20"/>
+          <w:szCs w:val="20"/>
+        </w:rPr>
+        <w:t>▼</w:t>
+      </w:r>
+    </w:p>
+    <w:p>
+      <w:pPr>
+        <w:rPr>
+          <w:sz w:val="20"/>
+          <w:szCs w:val="20"/>
+        </w:rPr>
+      </w:pPr>
+      <w:r>
+        <w:rPr>
+          <w:sz w:val="20"/>
+          <w:szCs w:val="20"/>
+        </w:rPr>
+        <w:t>GitHub</w:t>
+      </w:r>
+    </w:p>
+    <w:p>
+      <w:pPr>
+        <w:rPr>
+          <w:sz w:val="20"/>
+          <w:szCs w:val="20"/>
+        </w:rPr>
+      </w:pPr>
+      <w:r>
+        <w:rPr>
+          <w:sz w:val="20"/>
+          <w:szCs w:val="20"/>
+        </w:rPr>
+        <w:t xml:space="preserve">        │</w:t>
+      </w:r>
+    </w:p>
+    <w:p>
+      <w:pPr>
+        <w:rPr>
+          <w:sz w:val="20"/>
+          <w:szCs w:val="20"/>
+        </w:rPr>
+      </w:pPr>
+      <w:r>
+        <w:rPr>
+          <w:sz w:val="20"/>
+          <w:szCs w:val="20"/>
+        </w:rPr>
+        <w:t xml:space="preserve">        </w:t>
+      </w:r>
+      <w:r>
+        <w:rPr>
+          <w:rFonts w:ascii="Arial" w:hAnsi="Arial" w:cs="Arial"/>
+          <w:sz w:val="20"/>
+          <w:szCs w:val="20"/>
+        </w:rPr>
+        <w:t>▼</w:t>
+      </w:r>
+    </w:p>
+    <w:p>
+      <w:pPr>
+        <w:rPr>
+          <w:sz w:val="20"/>
+          <w:szCs w:val="20"/>
+        </w:rPr>
+      </w:pPr>
+      <w:proofErr w:type="spellStart"/>
+      <w:r>
+        <w:rPr>
+          <w:sz w:val="20"/>
+          <w:szCs w:val="20"/>
+        </w:rPr>
+        <w:t>ArgoCD</w:t>
+      </w:r>
+      <w:proofErr w:type="spellEnd"/>
+    </w:p>
+    <w:p>
+      <w:pPr>
+        <w:rPr>
+          <w:sz w:val="20"/>
+          <w:szCs w:val="20"/>
+        </w:rPr>
+      </w:pPr>
+      <w:r>
+        <w:rPr>
+          <w:sz w:val="20"/>
+          <w:szCs w:val="20"/>
+        </w:rPr>
+        <w:t xml:space="preserve">        │</w:t>
+      </w:r>
+    </w:p>
+    <w:p>
+      <w:pPr>
+        <w:rPr>
+          <w:sz w:val="20"/>
+          <w:szCs w:val="20"/>
+        </w:rPr>
+      </w:pPr>
+      <w:r>
+        <w:rPr>
+          <w:sz w:val="20"/>
+          <w:szCs w:val="20"/>
+        </w:rPr>
+        <w:t xml:space="preserve">        </w:t>
+      </w:r>
+      <w:r>
+        <w:rPr>
+          <w:rFonts w:ascii="Arial" w:hAnsi="Arial" w:cs="Arial"/>
+          <w:sz w:val="20"/>
+          <w:szCs w:val="20"/>
+        </w:rPr>
+        <w:t>▼</w:t>
+      </w:r>
+    </w:p>
+    <w:p>
+      <w:pPr>
+        <w:rPr>
+          <w:sz w:val="20"/>
+          <w:szCs w:val="20"/>
+        </w:rPr>
+      </w:pPr>
+      <w:r>
+        <w:rPr>
+          <w:sz w:val="20"/>
+          <w:szCs w:val="20"/>
+        </w:rPr>
+        <w:t>Argo Rollouts</w:t>
+      </w:r>
+    </w:p>
+    <w:p>
+      <w:pPr>
+        <w:rPr>
+          <w:sz w:val="20"/>
+          <w:szCs w:val="20"/>
+        </w:rPr>
+      </w:pPr>
+      <w:r>
+        <w:rPr>
+          <w:sz w:val="20"/>
+          <w:szCs w:val="20"/>
+        </w:rPr>
+        <w:t xml:space="preserve">        │</w:t>
+      </w:r>
+    </w:p>
+    <w:p>
+      <w:pPr>
+        <w:rPr>
+          <w:rFonts w:ascii="Arial" w:hAnsi="Arial" w:cs="Arial"/>
+          <w:sz w:val="20"/>
+          <w:szCs w:val="20"/>
+        </w:rPr>
+      </w:pPr>
+      <w:r>
+        <w:rPr>
+          <w:sz w:val="20"/>
+          <w:szCs w:val="20"/>
+        </w:rPr>
+        <w:t xml:space="preserve">        </w:t>
+      </w:r>
+      <w:r>
+        <w:rPr>
+          <w:rFonts w:ascii="Arial" w:hAnsi="Arial" w:cs="Arial"/>
+          <w:sz w:val="20"/>
+          <w:szCs w:val="20"/>
+        </w:rPr>
+        <w:t>▼</w:t>
+      </w:r>
+    </w:p>
+    <w:p>
+      <w:pPr>
+        <w:rPr>
+          <w:rFonts w:ascii="Arial" w:hAnsi="Arial" w:cs="Arial"/>
+          <w:sz w:val="20"/>
+          <w:szCs w:val="20"/>
+        </w:rPr>
+      </w:pPr>
+      <w:proofErr w:type="spellStart"/>
+      <w:r>
+        <w:rPr>
+          <w:sz w:val="20"/>
+          <w:szCs w:val="20"/>
+        </w:rPr>
+        <w:t>ReplicaSets</w:t>
+      </w:r>
+      <w:proofErr w:type="spellEnd"/>
+    </w:p>
+    <w:p>
+      <w:pPr>
+        <w:rPr>
+          <w:sz w:val="20"/>
+          <w:szCs w:val="20"/>
+        </w:rPr>
+      </w:pPr>
+      <w:r>
+        <w:rPr>
+          <w:sz w:val="20"/>
+          <w:szCs w:val="20"/>
+        </w:rPr>
+        <w:t xml:space="preserve">          │</w:t>
+      </w:r>
+    </w:p>
+    <w:p>
+      <w:pPr>
+        <w:rPr>
+          <w:sz w:val="20"/>
+          <w:szCs w:val="20"/>
+        </w:rPr>
+      </w:pPr>
+      <w:r>
+        <w:rPr>
+          <w:sz w:val="20"/>
+          <w:szCs w:val="20"/>
+        </w:rPr>
+        <w:t xml:space="preserve">         </w:t>
+      </w:r>
+      <w:r>
+        <w:rPr>
+          <w:rFonts w:ascii="Arial" w:hAnsi="Arial" w:cs="Arial"/>
+          <w:sz w:val="20"/>
+          <w:szCs w:val="20"/>
+        </w:rPr>
+        <w:t>▼</w:t>
+      </w:r>
+    </w:p>
+    <w:p>
+      <w:pPr>
+        <w:rPr>
+          <w:sz w:val="20"/>
+          <w:szCs w:val="20"/>
+        </w:rPr>
+      </w:pPr>
+      <w:r>
+        <w:rPr>
+          <w:sz w:val="20"/>
+          <w:szCs w:val="20"/>
+        </w:rPr>
+        <w:t xml:space="preserve">        Pods</w:t>
+      </w:r>
+    </w:p>
+    <w:p>
+      <w:pPr>
+        <w:rPr>
+          <w:sz w:val="20"/>
+          <w:szCs w:val="20"/>
+        </w:rPr>
+      </w:pPr>
+      <w:r>
+        <w:rPr>
+          <w:sz w:val="20"/>
+          <w:szCs w:val="20"/>
+        </w:rPr>
+        <w:t xml:space="preserve">         </w:t>
+      </w:r>
+      <w:r>
+        <w:rPr>
+          <w:sz w:val="20"/>
+          <w:szCs w:val="20"/>
+        </w:rPr>
+        <w:t>│</w:t>
+      </w:r>
+      <w:r>
+        <w:rPr>
+          <w:sz w:val="20"/>
+          <w:szCs w:val="20"/>
+        </w:rPr>
+        <w:br/>
+      </w:r>
+      <w:r>
+        <w:rPr>
+          <w:rFonts w:ascii="Arial" w:hAnsi="Arial" w:cs="Arial"/>
+          <w:sz w:val="20"/>
+          <w:szCs w:val="20"/>
+        </w:rPr>
+        <w:t xml:space="preserve">      </w:t>
+      </w:r>
+      <w:r>
+        <w:rPr>
+          <w:rFonts w:ascii="Arial" w:hAnsi="Arial" w:cs="Arial"/>
+          <w:sz w:val="20"/>
+          <w:szCs w:val="20"/>
+        </w:rPr>
+        <w:t>▼</w:t>
+      </w:r>
+      <w:r>
+        <w:rPr>
+          <w:sz w:val="20"/>
+          <w:szCs w:val="20"/>
+        </w:rPr>
+        <w:br/>
+        <w:t>Healthy Canary</w:t>
+      </w:r>
+    </w:p>
+    <w:p>
+      <w:r>
+        <w:lastRenderedPageBreak/>
+        <w:drawing>
+          <wp:inline distT="0" distB="0" distL="0" distR="0" wp14:anchorId="6571E9C6" wp14:editId="03869274">
+            <wp:extent cx="5943600" cy="6102350"/>
+            <wp:effectExtent l="0" t="0" r="0" b="0"/>
+            <wp:docPr id="1829465601" name="Picture 1"/>
+            <wp:cNvGraphicFramePr>
+              <a:graphicFrameLocks xmlns:a="http://schemas.openxmlformats.org/drawingml/2006/main" noChangeAspect="1"/>
+            </wp:cNvGraphicFramePr>
+            <a:graphic xmlns:a="http://schemas.openxmlformats.org/drawingml/2006/main">
+              <a:graphicData uri="http://schemas.openxmlformats.org/drawingml/2006/picture">
+                <pic:pic xmlns:pic="http://schemas.openxmlformats.org/drawingml/2006/picture">
+                  <pic:nvPicPr>
+                    <pic:cNvPr id="1829465601" name=""/>
+                    <pic:cNvPicPr/>
+                  </pic:nvPicPr>
+                  <pic:blipFill>
+                    <a:blip r:embed="rId23"/>
+                    <a:stretch>
+                      <a:fillRect/>
+                    </a:stretch>
+                  </pic:blipFill>
+                  <pic:spPr>
+                    <a:xfrm>
+                      <a:off x="0" y="0"/>
+                      <a:ext cx="5943600" cy="6102350"/>
+                    </a:xfrm>
+                    <a:prstGeom prst="rect">
+                      <a:avLst/>
+                    </a:prstGeom>
+                  </pic:spPr>
+                </pic:pic>
+              </a:graphicData>
+            </a:graphic>
+          </wp:inline>
+        </w:drawing>
+      </w:r>
+    </w:p>
     <w:p/>
     <w:p/>
     <w:p/>
     <w:p/>
     <w:p/>
-    <w:p/>
-    <w:p/>
-    <w:p/>
-    <w:p/>
-    <w:p/>
-    <w:p/>
-    <w:p/>
-    <w:p/>
-    <w:p/>
-    <w:p/>
-    <w:p/>
-    <w:p/>
-    <w:p/>
-    <w:p>
-      <w:pPr>
-        <w:rPr>
-          <w:b/>
-          <w:bCs/>
-        </w:rPr>
-      </w:pPr>
-      <w:r>
-        <w:rPr>
-          <w:rFonts w:ascii="Segoe UI Emoji" w:hAnsi="Segoe UI Emoji" w:cs="Segoe UI Emoji"/>
-          <w:b/>
-          <w:bCs/>
-        </w:rPr>
-        <w:t>✅</w:t>
-      </w:r>
-      <w:r>
-        <w:rPr>
-          <w:b/>
-          <w:bCs/>
-        </w:rPr>
-        <w:t xml:space="preserve"> </w:t>
-      </w:r>
-      <w:proofErr w:type="spellStart"/>
-      <w:r>
-        <w:rPr>
-          <w:b/>
-          <w:bCs/>
-        </w:rPr>
-        <w:t>GitOps</w:t>
-      </w:r>
-      <w:proofErr w:type="spellEnd"/>
-      <w:r>
-        <w:rPr>
-          <w:b/>
-          <w:bCs/>
-        </w:rPr>
-        <w:t xml:space="preserve"> Pipeline</w:t>
-      </w:r>
-    </w:p>
-    <w:p>
-      <w:r>
-        <w:t>Application Repo</w:t>
-      </w:r>
-      <w:r>
-        <w:br/>
-      </w:r>
-      <w:r>
-        <w:rPr>
-          <w:rFonts w:ascii="Segoe UI Emoji" w:hAnsi="Segoe UI Emoji" w:cs="Segoe UI Emoji"/>
-        </w:rPr>
-        <w:t>⬇️</w:t>
-      </w:r>
-    </w:p>
-    <w:p>
-      <w:r>
-        <w:t>Build Image</w:t>
-      </w:r>
-      <w:r>
-        <w:br/>
-      </w:r>
-      <w:r>
-        <w:rPr>
-          <w:rFonts w:ascii="Segoe UI Emoji" w:hAnsi="Segoe UI Emoji" w:cs="Segoe UI Emoji"/>
-        </w:rPr>
-        <w:t>⬇️</w:t>
-      </w:r>
-    </w:p>
-    <w:p>
-      <w:r>
-        <w:t>Push to ECR</w:t>
-      </w:r>
-      <w:r>
-        <w:br/>
-      </w:r>
-      <w:r>
-        <w:rPr>
-          <w:rFonts w:ascii="Segoe UI Emoji" w:hAnsi="Segoe UI Emoji" w:cs="Segoe UI Emoji"/>
-        </w:rPr>
-        <w:t>⬇️</w:t>
-      </w:r>
-    </w:p>
-    <w:p>
-      <w:r>
-        <w:t xml:space="preserve">Update </w:t>
-      </w:r>
-      <w:proofErr w:type="spellStart"/>
-      <w:r>
-        <w:t>GitOps</w:t>
-      </w:r>
-      <w:proofErr w:type="spellEnd"/>
-      <w:r>
-        <w:t xml:space="preserve"> repo (</w:t>
-      </w:r>
-      <w:proofErr w:type="spellStart"/>
-      <w:proofErr w:type="gramStart"/>
-      <w:r>
-        <w:t>values.yaml</w:t>
-      </w:r>
-      <w:proofErr w:type="spellEnd"/>
-      <w:proofErr w:type="gramEnd"/>
-      <w:r>
-        <w:t>)</w:t>
-      </w:r>
-      <w:r>
-        <w:br/>
-      </w:r>
-      <w:r>
-        <w:rPr>
-          <w:rFonts w:ascii="Segoe UI Emoji" w:hAnsi="Segoe UI Emoji" w:cs="Segoe UI Emoji"/>
-        </w:rPr>
-        <w:t>⬇️</w:t>
-      </w:r>
-    </w:p>
-    <w:p>
-      <w:r>
-        <w:lastRenderedPageBreak/>
-        <w:t>Commit automatically</w:t>
-      </w:r>
-      <w:r>
-        <w:br/>
-      </w:r>
-      <w:r>
-        <w:rPr>
-          <w:rFonts w:ascii="Segoe UI Emoji" w:hAnsi="Segoe UI Emoji" w:cs="Segoe UI Emoji"/>
-        </w:rPr>
-        <w:t>⬇️</w:t>
-      </w:r>
-    </w:p>
-    <w:p>
-      <w:proofErr w:type="spellStart"/>
-      <w:r>
-        <w:t>ArgoCD</w:t>
-      </w:r>
-      <w:proofErr w:type="spellEnd"/>
-      <w:r>
-        <w:t xml:space="preserve"> detects commit</w:t>
-      </w:r>
-      <w:r>
-        <w:br/>
-      </w:r>
-      <w:r>
-        <w:rPr>
-          <w:rFonts w:ascii="Segoe UI Emoji" w:hAnsi="Segoe UI Emoji" w:cs="Segoe UI Emoji"/>
-        </w:rPr>
-        <w:t>⬇️</w:t>
-      </w:r>
-    </w:p>
-    <w:p>
-      <w:r>
-        <w:t>Helm renders manifests</w:t>
-      </w:r>
-      <w:r>
-        <w:br/>
-      </w:r>
-      <w:r>
-        <w:rPr>
-          <w:rFonts w:ascii="Segoe UI Emoji" w:hAnsi="Segoe UI Emoji" w:cs="Segoe UI Emoji"/>
-        </w:rPr>
-        <w:t>⬇️</w:t>
-      </w:r>
-    </w:p>
-    <w:p>
-      <w:r>
-        <w:t>Deployment rolls out</w:t>
-      </w:r>
-      <w:r>
-        <w:br/>
-      </w:r>
-      <w:r>
-        <w:rPr>
-          <w:rFonts w:ascii="Segoe UI Emoji" w:hAnsi="Segoe UI Emoji" w:cs="Segoe UI Emoji"/>
-        </w:rPr>
-        <w:t>⬇️</w:t>
-      </w:r>
-    </w:p>
-    <w:p>
-      <w:r>
-        <w:t>Healthy</w:t>
-      </w:r>
-    </w:p>
     <w:p/>
     <w:sectPr>
       <w:pgSz w:w="12240" w:h="15840"/>
@@ -1971,7 +2582,6 @@
   <w:style w:type="character" w:default="1" w:styleId="DefaultParagraphFont">
     <w:name w:val="Default Paragraph Font"/>
     <w:uiPriority w:val="1"/>
-    <w:semiHidden/>
     <w:unhideWhenUsed/>
   </w:style>
   <w:style w:type="table" w:default="1" w:styleId="TableNormal">
@@ -2283,6 +2893,29 @@
       <w:smallCaps/>
       <w:color w:val="0F4761" w:themeColor="accent1" w:themeShade="BF"/>
       <w:spacing w:val="5"/>
+    </w:rPr>
+  </w:style>
+  <w:style w:type="character" w:styleId="Hyperlink">
+    <w:name w:val="Hyperlink"/>
+    <w:basedOn w:val="DefaultParagraphFont"/>
+    <w:uiPriority w:val="99"/>
+    <w:unhideWhenUsed/>
+    <w:rsid w:val="009B0205"/>
+    <w:rPr>
+      <w:color w:val="467886" w:themeColor="hyperlink"/>
+      <w:u w:val="single"/>
+    </w:rPr>
+  </w:style>
+  <w:style w:type="character" w:styleId="UnresolvedMention">
+    <w:name w:val="Unresolved Mention"/>
+    <w:basedOn w:val="DefaultParagraphFont"/>
+    <w:uiPriority w:val="99"/>
+    <w:semiHidden/>
+    <w:unhideWhenUsed/>
+    <w:rsid w:val="009B0205"/>
+    <w:rPr>
+      <w:color w:val="605E5C"/>
+      <w:shd w:val="clear" w:color="auto" w:fill="E1DFDD"/>
     </w:rPr>
   </w:style>
 </w:styles>

</xml_diff>

<commit_message>
docs:screenshots for implementing canary deployments with Argo Rollouts
</commit_message>
<xml_diff>
--- a/docs/usermgmt_ci_cd_screenshots.docx
+++ b/docs/usermgmt_ci_cd_screenshots.docx
@@ -9,21 +9,12 @@
           <w:bCs/>
         </w:rPr>
       </w:pPr>
-      <w:proofErr w:type="spellStart"/>
       <w:r>
         <w:rPr>
           <w:b/>
           <w:bCs/>
         </w:rPr>
-        <w:t>usermgmt</w:t>
-      </w:r>
-      <w:proofErr w:type="spellEnd"/>
-      <w:r>
-        <w:rPr>
-          <w:b/>
-          <w:bCs/>
-        </w:rPr>
-        <w:t xml:space="preserve"> ci/cd</w:t>
+        <w:t>usermgmt ci/cd</w:t>
       </w:r>
       <w:r>
         <w:rPr>
@@ -53,184 +44,140 @@
           <w:b/>
           <w:bCs/>
         </w:rPr>
-        <w:t xml:space="preserve"> </w:t>
-      </w:r>
-      <w:proofErr w:type="spellStart"/>
-      <w:r>
+        <w:t xml:space="preserve"> GitOps Pipeline</w:t>
+      </w:r>
+    </w:p>
+    <w:p>
+      <w:r>
+        <w:t>Application Repo</w:t>
+      </w:r>
+      <w:r>
+        <w:br/>
+      </w:r>
+      <w:r>
+        <w:rPr>
+          <w:rFonts w:ascii="Segoe UI Emoji" w:hAnsi="Segoe UI Emoji" w:cs="Segoe UI Emoji"/>
+        </w:rPr>
+        <w:t>⬇️</w:t>
+      </w:r>
+    </w:p>
+    <w:p>
+      <w:r>
+        <w:t>Build Image</w:t>
+      </w:r>
+      <w:r>
+        <w:br/>
+      </w:r>
+      <w:r>
+        <w:rPr>
+          <w:rFonts w:ascii="Segoe UI Emoji" w:hAnsi="Segoe UI Emoji" w:cs="Segoe UI Emoji"/>
+        </w:rPr>
+        <w:t>⬇️</w:t>
+      </w:r>
+    </w:p>
+    <w:p>
+      <w:r>
+        <w:t>Push to ECR</w:t>
+      </w:r>
+      <w:r>
+        <w:br/>
+      </w:r>
+      <w:r>
+        <w:rPr>
+          <w:rFonts w:ascii="Segoe UI Emoji" w:hAnsi="Segoe UI Emoji" w:cs="Segoe UI Emoji"/>
+        </w:rPr>
+        <w:t>⬇️</w:t>
+      </w:r>
+    </w:p>
+    <w:p>
+      <w:r>
+        <w:t>Update GitOps repo (values.yaml)</w:t>
+      </w:r>
+      <w:r>
+        <w:br/>
+      </w:r>
+      <w:r>
+        <w:rPr>
+          <w:rFonts w:ascii="Segoe UI Emoji" w:hAnsi="Segoe UI Emoji" w:cs="Segoe UI Emoji"/>
+        </w:rPr>
+        <w:t>⬇️</w:t>
+      </w:r>
+    </w:p>
+    <w:p>
+      <w:r>
+        <w:t>Commit automatically</w:t>
+      </w:r>
+      <w:r>
+        <w:br/>
+      </w:r>
+      <w:r>
+        <w:rPr>
+          <w:rFonts w:ascii="Segoe UI Emoji" w:hAnsi="Segoe UI Emoji" w:cs="Segoe UI Emoji"/>
+        </w:rPr>
+        <w:t>⬇️</w:t>
+      </w:r>
+    </w:p>
+    <w:p>
+      <w:r>
+        <w:t>ArgoCD detects commit</w:t>
+      </w:r>
+      <w:r>
+        <w:br/>
+      </w:r>
+      <w:r>
+        <w:rPr>
+          <w:rFonts w:ascii="Segoe UI Emoji" w:hAnsi="Segoe UI Emoji" w:cs="Segoe UI Emoji"/>
+        </w:rPr>
+        <w:t>⬇️</w:t>
+      </w:r>
+    </w:p>
+    <w:p>
+      <w:r>
+        <w:t>Helm renders manifests</w:t>
+      </w:r>
+      <w:r>
+        <w:br/>
+      </w:r>
+      <w:r>
+        <w:rPr>
+          <w:rFonts w:ascii="Segoe UI Emoji" w:hAnsi="Segoe UI Emoji" w:cs="Segoe UI Emoji"/>
+        </w:rPr>
+        <w:t>⬇️</w:t>
+      </w:r>
+    </w:p>
+    <w:p>
+      <w:r>
+        <w:t>Deployment rolls out</w:t>
+      </w:r>
+      <w:r>
+        <w:br/>
+      </w:r>
+      <w:r>
+        <w:rPr>
+          <w:rFonts w:ascii="Segoe UI Emoji" w:hAnsi="Segoe UI Emoji" w:cs="Segoe UI Emoji"/>
+        </w:rPr>
+        <w:t>⬇️</w:t>
+      </w:r>
+    </w:p>
+    <w:p>
+      <w:r>
+        <w:t>Healthy</w:t>
+      </w:r>
+    </w:p>
+    <w:p>
+      <w:pPr>
         <w:rPr>
           <w:b/>
           <w:bCs/>
         </w:rPr>
-        <w:t>GitOps</w:t>
-      </w:r>
-      <w:proofErr w:type="spellEnd"/>
-      <w:r>
-        <w:rPr>
-          <w:b/>
-          <w:bCs/>
-        </w:rPr>
-        <w:t xml:space="preserve"> Pipeline</w:t>
-      </w:r>
-    </w:p>
-    <w:p>
-      <w:r>
-        <w:t>Application Repo</w:t>
-      </w:r>
-      <w:r>
-        <w:br/>
-      </w:r>
-      <w:r>
-        <w:rPr>
-          <w:rFonts w:ascii="Segoe UI Emoji" w:hAnsi="Segoe UI Emoji" w:cs="Segoe UI Emoji"/>
-        </w:rPr>
-        <w:t>⬇️</w:t>
-      </w:r>
-    </w:p>
-    <w:p>
-      <w:r>
-        <w:t>Build Image</w:t>
-      </w:r>
-      <w:r>
-        <w:br/>
-      </w:r>
-      <w:r>
-        <w:rPr>
-          <w:rFonts w:ascii="Segoe UI Emoji" w:hAnsi="Segoe UI Emoji" w:cs="Segoe UI Emoji"/>
-        </w:rPr>
-        <w:t>⬇️</w:t>
-      </w:r>
-    </w:p>
-    <w:p>
-      <w:r>
-        <w:t>Push to ECR</w:t>
-      </w:r>
-      <w:r>
-        <w:br/>
-      </w:r>
-      <w:r>
-        <w:rPr>
-          <w:rFonts w:ascii="Segoe UI Emoji" w:hAnsi="Segoe UI Emoji" w:cs="Segoe UI Emoji"/>
-        </w:rPr>
-        <w:t>⬇️</w:t>
-      </w:r>
-    </w:p>
-    <w:p>
-      <w:r>
-        <w:t xml:space="preserve">Update </w:t>
-      </w:r>
-      <w:proofErr w:type="spellStart"/>
-      <w:r>
-        <w:t>GitOps</w:t>
-      </w:r>
-      <w:proofErr w:type="spellEnd"/>
-      <w:r>
-        <w:t xml:space="preserve"> repo (</w:t>
-      </w:r>
-      <w:proofErr w:type="spellStart"/>
-      <w:proofErr w:type="gramStart"/>
-      <w:r>
-        <w:t>values.yaml</w:t>
-      </w:r>
-      <w:proofErr w:type="spellEnd"/>
-      <w:proofErr w:type="gramEnd"/>
-      <w:r>
-        <w:t>)</w:t>
-      </w:r>
-      <w:r>
-        <w:br/>
-      </w:r>
-      <w:r>
-        <w:rPr>
-          <w:rFonts w:ascii="Segoe UI Emoji" w:hAnsi="Segoe UI Emoji" w:cs="Segoe UI Emoji"/>
-        </w:rPr>
-        <w:t>⬇️</w:t>
-      </w:r>
-    </w:p>
-    <w:p>
-      <w:r>
-        <w:t>Commit automatically</w:t>
-      </w:r>
-      <w:r>
-        <w:br/>
-      </w:r>
-      <w:r>
-        <w:rPr>
-          <w:rFonts w:ascii="Segoe UI Emoji" w:hAnsi="Segoe UI Emoji" w:cs="Segoe UI Emoji"/>
-        </w:rPr>
-        <w:t>⬇️</w:t>
-      </w:r>
-    </w:p>
-    <w:p>
-      <w:proofErr w:type="spellStart"/>
-      <w:r>
-        <w:t>ArgoCD</w:t>
-      </w:r>
-      <w:proofErr w:type="spellEnd"/>
-      <w:r>
-        <w:t xml:space="preserve"> detects commit</w:t>
-      </w:r>
-      <w:r>
-        <w:br/>
-      </w:r>
-      <w:r>
-        <w:rPr>
-          <w:rFonts w:ascii="Segoe UI Emoji" w:hAnsi="Segoe UI Emoji" w:cs="Segoe UI Emoji"/>
-        </w:rPr>
-        <w:t>⬇️</w:t>
-      </w:r>
-    </w:p>
-    <w:p>
-      <w:r>
-        <w:t>Helm renders manifests</w:t>
-      </w:r>
-      <w:r>
-        <w:br/>
-      </w:r>
-      <w:r>
-        <w:rPr>
-          <w:rFonts w:ascii="Segoe UI Emoji" w:hAnsi="Segoe UI Emoji" w:cs="Segoe UI Emoji"/>
-        </w:rPr>
-        <w:t>⬇️</w:t>
-      </w:r>
-    </w:p>
-    <w:p>
-      <w:r>
-        <w:t>Deployment rolls out</w:t>
-      </w:r>
-      <w:r>
-        <w:br/>
-      </w:r>
-      <w:r>
-        <w:rPr>
-          <w:rFonts w:ascii="Segoe UI Emoji" w:hAnsi="Segoe UI Emoji" w:cs="Segoe UI Emoji"/>
-        </w:rPr>
-        <w:t>⬇️</w:t>
-      </w:r>
-    </w:p>
-    <w:p>
-      <w:r>
-        <w:t>Healthy</w:t>
-      </w:r>
-    </w:p>
-    <w:p>
-      <w:pPr>
-        <w:rPr>
-          <w:b/>
-          <w:bCs/>
-        </w:rPr>
       </w:pPr>
     </w:p>
     <w:p>
       <w:r>
         <w:t xml:space="preserve">1. </w:t>
       </w:r>
-      <w:proofErr w:type="spellStart"/>
-      <w:r>
-        <w:t>ArgoCD</w:t>
-      </w:r>
-      <w:proofErr w:type="spellEnd"/>
-      <w:r>
-        <w:t xml:space="preserve"> </w:t>
+      <w:r>
+        <w:t xml:space="preserve">ArgoCD </w:t>
       </w:r>
       <w:r>
         <w:t>controller</w:t>
@@ -341,35 +288,7 @@
         <w:rPr>
           <w:highlight w:val="yellow"/>
         </w:rPr>
-        <w:t xml:space="preserve">Get </w:t>
-      </w:r>
-      <w:proofErr w:type="spellStart"/>
-      <w:r>
-        <w:rPr>
-          <w:highlight w:val="yellow"/>
-        </w:rPr>
-        <w:t>argocd</w:t>
-      </w:r>
-      <w:proofErr w:type="spellEnd"/>
-      <w:r>
-        <w:rPr>
-          <w:highlight w:val="yellow"/>
-        </w:rPr>
-        <w:t xml:space="preserve"> </w:t>
-      </w:r>
-      <w:proofErr w:type="spellStart"/>
-      <w:r>
-        <w:rPr>
-          <w:highlight w:val="yellow"/>
-        </w:rPr>
-        <w:t>ui</w:t>
-      </w:r>
-      <w:proofErr w:type="spellEnd"/>
-      <w:r>
-        <w:rPr>
-          <w:highlight w:val="yellow"/>
-        </w:rPr>
-        <w:t xml:space="preserve"> default admin password and change it.</w:t>
+        <w:t>Get argocd ui default admin password and change it.</w:t>
       </w:r>
       <w:r>
         <w:t xml:space="preserve"> </w:t>
@@ -420,49 +339,7 @@
         <w:rPr>
           <w:highlight w:val="yellow"/>
         </w:rPr>
-        <w:t xml:space="preserve">Route53 with </w:t>
-      </w:r>
-      <w:proofErr w:type="spellStart"/>
-      <w:r>
-        <w:rPr>
-          <w:highlight w:val="yellow"/>
-        </w:rPr>
-        <w:t>argocd</w:t>
-      </w:r>
-      <w:proofErr w:type="spellEnd"/>
-      <w:r>
-        <w:rPr>
-          <w:highlight w:val="yellow"/>
-        </w:rPr>
-        <w:t xml:space="preserve"> and </w:t>
-      </w:r>
-      <w:proofErr w:type="spellStart"/>
-      <w:r>
-        <w:rPr>
-          <w:highlight w:val="yellow"/>
-        </w:rPr>
-        <w:t>usermgmt</w:t>
-      </w:r>
-      <w:proofErr w:type="spellEnd"/>
-      <w:r>
-        <w:rPr>
-          <w:highlight w:val="yellow"/>
-        </w:rPr>
-        <w:t xml:space="preserve"> service </w:t>
-      </w:r>
-      <w:proofErr w:type="spellStart"/>
-      <w:r>
-        <w:rPr>
-          <w:highlight w:val="yellow"/>
-        </w:rPr>
-        <w:t>dns</w:t>
-      </w:r>
-      <w:proofErr w:type="spellEnd"/>
-      <w:r>
-        <w:rPr>
-          <w:highlight w:val="yellow"/>
-        </w:rPr>
-        <w:t xml:space="preserve"> records</w:t>
+        <w:t>Route53 with argocd and usermgmt service dns records</w:t>
       </w:r>
     </w:p>
     <w:p>
@@ -508,48 +385,12 @@
       </w:r>
     </w:p>
     <w:p>
-      <w:proofErr w:type="spellStart"/>
       <w:r>
         <w:rPr>
           <w:highlight w:val="yellow"/>
         </w:rPr>
         <w:lastRenderedPageBreak/>
-        <w:t>ArgoCD</w:t>
-      </w:r>
-      <w:proofErr w:type="spellEnd"/>
-      <w:r>
-        <w:rPr>
-          <w:highlight w:val="yellow"/>
-        </w:rPr>
-        <w:t xml:space="preserve"> </w:t>
-      </w:r>
-      <w:proofErr w:type="spellStart"/>
-      <w:r>
-        <w:rPr>
-          <w:highlight w:val="yellow"/>
-        </w:rPr>
-        <w:t>ui</w:t>
-      </w:r>
-      <w:proofErr w:type="spellEnd"/>
-      <w:r>
-        <w:rPr>
-          <w:highlight w:val="yellow"/>
-        </w:rPr>
-        <w:t xml:space="preserve"> (applications have not yet been deployed by </w:t>
-      </w:r>
-      <w:proofErr w:type="spellStart"/>
-      <w:r>
-        <w:rPr>
-          <w:highlight w:val="yellow"/>
-        </w:rPr>
-        <w:t>ArgoCD</w:t>
-      </w:r>
-      <w:proofErr w:type="spellEnd"/>
-      <w:r>
-        <w:rPr>
-          <w:highlight w:val="yellow"/>
-        </w:rPr>
-        <w:t>)</w:t>
+        <w:t>ArgoCD ui (applications have not yet been deployed by ArgoCD)</w:t>
       </w:r>
     </w:p>
     <w:p>
@@ -707,20 +548,12 @@
     <w:p/>
     <w:p/>
     <w:p>
-      <w:proofErr w:type="spellStart"/>
       <w:r>
         <w:rPr>
           <w:highlight w:val="yellow"/>
         </w:rPr>
         <w:lastRenderedPageBreak/>
-        <w:t>GitOps</w:t>
-      </w:r>
-      <w:proofErr w:type="spellEnd"/>
-      <w:r>
-        <w:rPr>
-          <w:highlight w:val="yellow"/>
-        </w:rPr>
-        <w:t xml:space="preserve"> CI/CD succeeded with commit tag</w:t>
+        <w:t>GitOps CI/CD succeeded with commit tag</w:t>
       </w:r>
     </w:p>
     <w:p>
@@ -816,13 +649,8 @@
       </w:r>
     </w:p>
     <w:p>
-      <w:proofErr w:type="spellStart"/>
-      <w:r>
-        <w:t>GitOps</w:t>
-      </w:r>
-      <w:proofErr w:type="spellEnd"/>
-      <w:r>
-        <w:t xml:space="preserve"> repo updated with latest </w:t>
+      <w:r>
+        <w:t xml:space="preserve">GitOps repo updated with latest </w:t>
       </w:r>
       <w:r>
         <w:t>image</w:t>
@@ -875,13 +703,8 @@
       </w:r>
     </w:p>
     <w:p>
-      <w:proofErr w:type="spellStart"/>
-      <w:r>
-        <w:t>ArgoCD</w:t>
-      </w:r>
-      <w:proofErr w:type="spellEnd"/>
-      <w:r>
-        <w:t xml:space="preserve"> healthy and in sync with the live state of the EKS cluster.</w:t>
+      <w:r>
+        <w:t>ArgoCD healthy and in sync with the live state of the EKS cluster.</w:t>
       </w:r>
     </w:p>
     <w:p>
@@ -1069,7 +892,6 @@
           <w:bCs/>
         </w:rPr>
       </w:pPr>
-      <w:proofErr w:type="spellStart"/>
       <w:r>
         <w:rPr>
           <w:b/>
@@ -1078,7 +900,6 @@
         </w:rPr>
         <w:t>adot_metrics</w:t>
       </w:r>
-      <w:proofErr w:type="spellEnd"/>
       <w:r>
         <w:rPr>
           <w:b/>
@@ -1090,15 +911,7 @@
     </w:p>
     <w:p>
       <w:r>
-        <w:t xml:space="preserve">- deploy </w:t>
-      </w:r>
-      <w:proofErr w:type="spellStart"/>
-      <w:r>
-        <w:t>OpenTelemetry</w:t>
-      </w:r>
-      <w:proofErr w:type="spellEnd"/>
-      <w:r>
-        <w:t xml:space="preserve"> metrics collector</w:t>
+        <w:t>- deploy OpenTelemetry metrics collector</w:t>
       </w:r>
     </w:p>
     <w:p>
@@ -1108,13 +921,8 @@
     </w:p>
     <w:p>
       <w:r>
-        <w:t xml:space="preserve">- integrate Amazon Managed Grafana </w:t>
-      </w:r>
-      <w:proofErr w:type="spellStart"/>
-      <w:r>
-        <w:t>datasource</w:t>
-      </w:r>
-      <w:proofErr w:type="spellEnd"/>
+        <w:t>- integrate Amazon Managed Grafana datasource</w:t>
+      </w:r>
     </w:p>
     <w:p>
       <w:r>
@@ -1227,41 +1035,13 @@
         <w:rPr>
           <w:highlight w:val="yellow"/>
         </w:rPr>
-        <w:t>/</w:t>
-      </w:r>
-      <w:proofErr w:type="gramStart"/>
+        <w:t xml:space="preserve">/Prometheus </w:t>
+      </w:r>
       <w:r>
         <w:rPr>
           <w:highlight w:val="yellow"/>
         </w:rPr>
-        <w:t xml:space="preserve">Prometheus </w:t>
-      </w:r>
-      <w:r>
-        <w:rPr>
-          <w:highlight w:val="yellow"/>
-        </w:rPr>
-        <w:t xml:space="preserve"> dashboard</w:t>
-      </w:r>
-      <w:proofErr w:type="gramEnd"/>
-      <w:r>
-        <w:rPr>
-          <w:highlight w:val="yellow"/>
-        </w:rPr>
-        <w:t xml:space="preserve"> for </w:t>
-      </w:r>
-      <w:proofErr w:type="spellStart"/>
-      <w:r>
-        <w:rPr>
-          <w:highlight w:val="yellow"/>
-        </w:rPr>
-        <w:t>usermgmt</w:t>
-      </w:r>
-      <w:proofErr w:type="spellEnd"/>
-      <w:r>
-        <w:rPr>
-          <w:highlight w:val="yellow"/>
-        </w:rPr>
-        <w:t xml:space="preserve"> service</w:t>
+        <w:t xml:space="preserve"> dashboard for usermgmt service</w:t>
       </w:r>
     </w:p>
     <w:p>
@@ -1367,29 +1147,7 @@
             <w:sz w:val="20"/>
             <w:szCs w:val="20"/>
           </w:rPr>
-          <w:t xml:space="preserve">feat(platform): </w:t>
-        </w:r>
-        <w:proofErr w:type="gramStart"/>
-        <w:r>
-          <w:rPr>
-            <w:rStyle w:val="Hyperlink"/>
-            <w:b/>
-            <w:bCs/>
-            <w:sz w:val="20"/>
-            <w:szCs w:val="20"/>
-          </w:rPr>
-          <w:t>migrate</w:t>
-        </w:r>
-        <w:proofErr w:type="gramEnd"/>
-        <w:r>
-          <w:rPr>
-            <w:rStyle w:val="Hyperlink"/>
-            <w:b/>
-            <w:bCs/>
-            <w:sz w:val="20"/>
-            <w:szCs w:val="20"/>
-          </w:rPr>
-          <w:t xml:space="preserve"> User Management to Argo Rollouts</w:t>
+          <w:t>feat(platform): migrate User Management to Argo Rollouts</w:t>
         </w:r>
       </w:hyperlink>
     </w:p>
@@ -1402,7 +1160,6 @@
           <w:szCs w:val="20"/>
         </w:rPr>
       </w:pPr>
-      <w:proofErr w:type="spellStart"/>
       <w:r>
         <w:rPr>
           <w:b/>
@@ -1411,34 +1168,288 @@
           <w:szCs w:val="20"/>
           <w:highlight w:val="yellow"/>
         </w:rPr>
+        <w:t>ArgoCD Rollouts-Canary</w:t>
+      </w:r>
+    </w:p>
+    <w:p>
+      <w:pPr>
+        <w:rPr>
+          <w:sz w:val="20"/>
+          <w:szCs w:val="20"/>
+        </w:rPr>
+      </w:pPr>
+      <w:r>
+        <w:rPr>
+          <w:sz w:val="20"/>
+          <w:szCs w:val="20"/>
+        </w:rPr>
+        <w:t>Feature Branch</w:t>
+      </w:r>
+    </w:p>
+    <w:p>
+      <w:pPr>
+        <w:rPr>
+          <w:sz w:val="20"/>
+          <w:szCs w:val="20"/>
+        </w:rPr>
+      </w:pPr>
+      <w:r>
+        <w:rPr>
+          <w:sz w:val="20"/>
+          <w:szCs w:val="20"/>
+        </w:rPr>
+        <w:t xml:space="preserve">        │</w:t>
+      </w:r>
+    </w:p>
+    <w:p>
+      <w:pPr>
+        <w:rPr>
+          <w:sz w:val="20"/>
+          <w:szCs w:val="20"/>
+        </w:rPr>
+      </w:pPr>
+      <w:r>
+        <w:rPr>
+          <w:sz w:val="20"/>
+          <w:szCs w:val="20"/>
+        </w:rPr>
+        <w:t xml:space="preserve">        </w:t>
+      </w:r>
+      <w:r>
+        <w:rPr>
+          <w:rFonts w:ascii="Arial" w:hAnsi="Arial" w:cs="Arial"/>
+          <w:sz w:val="20"/>
+          <w:szCs w:val="20"/>
+        </w:rPr>
+        <w:t>▼</w:t>
+      </w:r>
+    </w:p>
+    <w:p>
+      <w:pPr>
+        <w:rPr>
+          <w:sz w:val="20"/>
+          <w:szCs w:val="20"/>
+        </w:rPr>
+      </w:pPr>
+      <w:r>
+        <w:rPr>
+          <w:sz w:val="20"/>
+          <w:szCs w:val="20"/>
+        </w:rPr>
+        <w:t>Helm Validation</w:t>
+      </w:r>
+    </w:p>
+    <w:p>
+      <w:pPr>
+        <w:rPr>
+          <w:sz w:val="20"/>
+          <w:szCs w:val="20"/>
+        </w:rPr>
+      </w:pPr>
+      <w:r>
+        <w:rPr>
+          <w:sz w:val="20"/>
+          <w:szCs w:val="20"/>
+        </w:rPr>
+        <w:t xml:space="preserve">        │</w:t>
+      </w:r>
+    </w:p>
+    <w:p>
+      <w:pPr>
+        <w:rPr>
+          <w:sz w:val="20"/>
+          <w:szCs w:val="20"/>
+        </w:rPr>
+      </w:pPr>
+      <w:r>
+        <w:rPr>
+          <w:sz w:val="20"/>
+          <w:szCs w:val="20"/>
+        </w:rPr>
+        <w:t xml:space="preserve">        </w:t>
+      </w:r>
+      <w:r>
+        <w:rPr>
+          <w:rFonts w:ascii="Arial" w:hAnsi="Arial" w:cs="Arial"/>
+          <w:sz w:val="20"/>
+          <w:szCs w:val="20"/>
+        </w:rPr>
+        <w:t>▼</w:t>
+      </w:r>
+    </w:p>
+    <w:p>
+      <w:pPr>
+        <w:rPr>
+          <w:sz w:val="20"/>
+          <w:szCs w:val="20"/>
+        </w:rPr>
+      </w:pPr>
+      <w:r>
+        <w:rPr>
+          <w:sz w:val="20"/>
+          <w:szCs w:val="20"/>
+        </w:rPr>
+        <w:t>Git Commit</w:t>
+      </w:r>
+    </w:p>
+    <w:p>
+      <w:pPr>
+        <w:rPr>
+          <w:sz w:val="20"/>
+          <w:szCs w:val="20"/>
+        </w:rPr>
+      </w:pPr>
+      <w:r>
+        <w:rPr>
+          <w:sz w:val="20"/>
+          <w:szCs w:val="20"/>
+        </w:rPr>
+        <w:t xml:space="preserve">        │</w:t>
+      </w:r>
+    </w:p>
+    <w:p>
+      <w:pPr>
+        <w:rPr>
+          <w:sz w:val="20"/>
+          <w:szCs w:val="20"/>
+        </w:rPr>
+      </w:pPr>
+      <w:r>
+        <w:rPr>
+          <w:sz w:val="20"/>
+          <w:szCs w:val="20"/>
+        </w:rPr>
+        <w:t xml:space="preserve">        </w:t>
+      </w:r>
+      <w:r>
+        <w:rPr>
+          <w:rFonts w:ascii="Arial" w:hAnsi="Arial" w:cs="Arial"/>
+          <w:sz w:val="20"/>
+          <w:szCs w:val="20"/>
+        </w:rPr>
+        <w:t>▼</w:t>
+      </w:r>
+    </w:p>
+    <w:p>
+      <w:pPr>
+        <w:rPr>
+          <w:sz w:val="20"/>
+          <w:szCs w:val="20"/>
+        </w:rPr>
+      </w:pPr>
+      <w:r>
+        <w:rPr>
+          <w:sz w:val="20"/>
+          <w:szCs w:val="20"/>
+        </w:rPr>
+        <w:t>Merge to Main</w:t>
+      </w:r>
+    </w:p>
+    <w:p>
+      <w:pPr>
+        <w:rPr>
+          <w:sz w:val="20"/>
+          <w:szCs w:val="20"/>
+        </w:rPr>
+      </w:pPr>
+      <w:r>
+        <w:rPr>
+          <w:sz w:val="20"/>
+          <w:szCs w:val="20"/>
+        </w:rPr>
+        <w:t xml:space="preserve">        │</w:t>
+      </w:r>
+    </w:p>
+    <w:p>
+      <w:pPr>
+        <w:rPr>
+          <w:sz w:val="20"/>
+          <w:szCs w:val="20"/>
+        </w:rPr>
+      </w:pPr>
+      <w:r>
+        <w:rPr>
+          <w:sz w:val="20"/>
+          <w:szCs w:val="20"/>
+        </w:rPr>
+        <w:t xml:space="preserve">        </w:t>
+      </w:r>
+      <w:r>
+        <w:rPr>
+          <w:rFonts w:ascii="Arial" w:hAnsi="Arial" w:cs="Arial"/>
+          <w:sz w:val="20"/>
+          <w:szCs w:val="20"/>
+        </w:rPr>
+        <w:t>▼</w:t>
+      </w:r>
+    </w:p>
+    <w:p>
+      <w:pPr>
+        <w:rPr>
+          <w:sz w:val="20"/>
+          <w:szCs w:val="20"/>
+        </w:rPr>
+      </w:pPr>
+      <w:r>
+        <w:rPr>
+          <w:sz w:val="20"/>
+          <w:szCs w:val="20"/>
+        </w:rPr>
+        <w:t>GitHub</w:t>
+      </w:r>
+    </w:p>
+    <w:p>
+      <w:pPr>
+        <w:rPr>
+          <w:sz w:val="20"/>
+          <w:szCs w:val="20"/>
+        </w:rPr>
+      </w:pPr>
+      <w:r>
+        <w:rPr>
+          <w:sz w:val="20"/>
+          <w:szCs w:val="20"/>
+        </w:rPr>
+        <w:t xml:space="preserve">        │</w:t>
+      </w:r>
+    </w:p>
+    <w:p>
+      <w:pPr>
+        <w:rPr>
+          <w:sz w:val="20"/>
+          <w:szCs w:val="20"/>
+        </w:rPr>
+      </w:pPr>
+      <w:r>
+        <w:rPr>
+          <w:sz w:val="20"/>
+          <w:szCs w:val="20"/>
+        </w:rPr>
+        <w:t xml:space="preserve">        </w:t>
+      </w:r>
+      <w:r>
+        <w:rPr>
+          <w:rFonts w:ascii="Arial" w:hAnsi="Arial" w:cs="Arial"/>
+          <w:sz w:val="20"/>
+          <w:szCs w:val="20"/>
+        </w:rPr>
+        <w:t>▼</w:t>
+      </w:r>
+    </w:p>
+    <w:p>
+      <w:pPr>
+        <w:rPr>
+          <w:sz w:val="20"/>
+          <w:szCs w:val="20"/>
+        </w:rPr>
+      </w:pPr>
+      <w:r>
+        <w:rPr>
+          <w:sz w:val="20"/>
+          <w:szCs w:val="20"/>
+        </w:rPr>
         <w:t>ArgoCD</w:t>
       </w:r>
-      <w:proofErr w:type="spellEnd"/>
-      <w:r>
-        <w:rPr>
-          <w:b/>
-          <w:bCs/>
-          <w:sz w:val="20"/>
-          <w:szCs w:val="20"/>
-          <w:highlight w:val="yellow"/>
-        </w:rPr>
-        <w:t xml:space="preserve"> Rollouts-Canary</w:t>
-      </w:r>
-    </w:p>
-    <w:p>
-      <w:pPr>
-        <w:rPr>
-          <w:sz w:val="20"/>
-          <w:szCs w:val="20"/>
-        </w:rPr>
-      </w:pPr>
-      <w:r>
-        <w:rPr>
-          <w:sz w:val="20"/>
-          <w:szCs w:val="20"/>
-        </w:rPr>
-        <w:t>Feature Branch</w:t>
-      </w:r>
     </w:p>
     <w:p>
       <w:pPr>
@@ -1490,7 +1501,7 @@
           <w:sz w:val="20"/>
           <w:szCs w:val="20"/>
         </w:rPr>
-        <w:t>Helm Validation</w:t>
+        <w:t>Argo Rollouts</w:t>
       </w:r>
     </w:p>
     <w:p>
@@ -1511,6 +1522,7 @@
     <w:p>
       <w:pPr>
         <w:rPr>
+          <w:rFonts w:ascii="Arial" w:hAnsi="Arial" w:cs="Arial"/>
           <w:sz w:val="20"/>
           <w:szCs w:val="20"/>
         </w:rPr>
@@ -1534,280 +1546,11 @@
     <w:p>
       <w:pPr>
         <w:rPr>
-          <w:sz w:val="20"/>
-          <w:szCs w:val="20"/>
-        </w:rPr>
-      </w:pPr>
-      <w:r>
-        <w:rPr>
-          <w:sz w:val="20"/>
-          <w:szCs w:val="20"/>
-        </w:rPr>
-        <w:t>Git Commit</w:t>
-      </w:r>
-    </w:p>
-    <w:p>
-      <w:pPr>
-        <w:rPr>
-          <w:sz w:val="20"/>
-          <w:szCs w:val="20"/>
-        </w:rPr>
-      </w:pPr>
-      <w:r>
-        <w:rPr>
-          <w:sz w:val="20"/>
-          <w:szCs w:val="20"/>
-        </w:rPr>
-        <w:t xml:space="preserve">        │</w:t>
-      </w:r>
-    </w:p>
-    <w:p>
-      <w:pPr>
-        <w:rPr>
-          <w:sz w:val="20"/>
-          <w:szCs w:val="20"/>
-        </w:rPr>
-      </w:pPr>
-      <w:r>
-        <w:rPr>
-          <w:sz w:val="20"/>
-          <w:szCs w:val="20"/>
-        </w:rPr>
-        <w:t xml:space="preserve">        </w:t>
-      </w:r>
-      <w:r>
-        <w:rPr>
           <w:rFonts w:ascii="Arial" w:hAnsi="Arial" w:cs="Arial"/>
           <w:sz w:val="20"/>
           <w:szCs w:val="20"/>
         </w:rPr>
-        <w:t>▼</w:t>
-      </w:r>
-    </w:p>
-    <w:p>
-      <w:pPr>
-        <w:rPr>
-          <w:sz w:val="20"/>
-          <w:szCs w:val="20"/>
-        </w:rPr>
-      </w:pPr>
-      <w:r>
-        <w:rPr>
-          <w:sz w:val="20"/>
-          <w:szCs w:val="20"/>
-        </w:rPr>
-        <w:t>Merge to Main</w:t>
-      </w:r>
-    </w:p>
-    <w:p>
-      <w:pPr>
-        <w:rPr>
-          <w:sz w:val="20"/>
-          <w:szCs w:val="20"/>
-        </w:rPr>
-      </w:pPr>
-      <w:r>
-        <w:rPr>
-          <w:sz w:val="20"/>
-          <w:szCs w:val="20"/>
-        </w:rPr>
-        <w:t xml:space="preserve">        │</w:t>
-      </w:r>
-    </w:p>
-    <w:p>
-      <w:pPr>
-        <w:rPr>
-          <w:sz w:val="20"/>
-          <w:szCs w:val="20"/>
-        </w:rPr>
-      </w:pPr>
-      <w:r>
-        <w:rPr>
-          <w:sz w:val="20"/>
-          <w:szCs w:val="20"/>
-        </w:rPr>
-        <w:t xml:space="preserve">        </w:t>
-      </w:r>
-      <w:r>
-        <w:rPr>
-          <w:rFonts w:ascii="Arial" w:hAnsi="Arial" w:cs="Arial"/>
-          <w:sz w:val="20"/>
-          <w:szCs w:val="20"/>
-        </w:rPr>
-        <w:t>▼</w:t>
-      </w:r>
-    </w:p>
-    <w:p>
-      <w:pPr>
-        <w:rPr>
-          <w:sz w:val="20"/>
-          <w:szCs w:val="20"/>
-        </w:rPr>
-      </w:pPr>
-      <w:r>
-        <w:rPr>
-          <w:sz w:val="20"/>
-          <w:szCs w:val="20"/>
-        </w:rPr>
-        <w:t>GitHub</w:t>
-      </w:r>
-    </w:p>
-    <w:p>
-      <w:pPr>
-        <w:rPr>
-          <w:sz w:val="20"/>
-          <w:szCs w:val="20"/>
-        </w:rPr>
-      </w:pPr>
-      <w:r>
-        <w:rPr>
-          <w:sz w:val="20"/>
-          <w:szCs w:val="20"/>
-        </w:rPr>
-        <w:t xml:space="preserve">        │</w:t>
-      </w:r>
-    </w:p>
-    <w:p>
-      <w:pPr>
-        <w:rPr>
-          <w:sz w:val="20"/>
-          <w:szCs w:val="20"/>
-        </w:rPr>
-      </w:pPr>
-      <w:r>
-        <w:rPr>
-          <w:sz w:val="20"/>
-          <w:szCs w:val="20"/>
-        </w:rPr>
-        <w:t xml:space="preserve">        </w:t>
-      </w:r>
-      <w:r>
-        <w:rPr>
-          <w:rFonts w:ascii="Arial" w:hAnsi="Arial" w:cs="Arial"/>
-          <w:sz w:val="20"/>
-          <w:szCs w:val="20"/>
-        </w:rPr>
-        <w:t>▼</w:t>
-      </w:r>
-    </w:p>
-    <w:p>
-      <w:pPr>
-        <w:rPr>
-          <w:sz w:val="20"/>
-          <w:szCs w:val="20"/>
-        </w:rPr>
-      </w:pPr>
-      <w:proofErr w:type="spellStart"/>
-      <w:r>
-        <w:rPr>
-          <w:sz w:val="20"/>
-          <w:szCs w:val="20"/>
-        </w:rPr>
-        <w:t>ArgoCD</w:t>
-      </w:r>
-      <w:proofErr w:type="spellEnd"/>
-    </w:p>
-    <w:p>
-      <w:pPr>
-        <w:rPr>
-          <w:sz w:val="20"/>
-          <w:szCs w:val="20"/>
-        </w:rPr>
-      </w:pPr>
-      <w:r>
-        <w:rPr>
-          <w:sz w:val="20"/>
-          <w:szCs w:val="20"/>
-        </w:rPr>
-        <w:t xml:space="preserve">        │</w:t>
-      </w:r>
-    </w:p>
-    <w:p>
-      <w:pPr>
-        <w:rPr>
-          <w:sz w:val="20"/>
-          <w:szCs w:val="20"/>
-        </w:rPr>
-      </w:pPr>
-      <w:r>
-        <w:rPr>
-          <w:sz w:val="20"/>
-          <w:szCs w:val="20"/>
-        </w:rPr>
-        <w:t xml:space="preserve">        </w:t>
-      </w:r>
-      <w:r>
-        <w:rPr>
-          <w:rFonts w:ascii="Arial" w:hAnsi="Arial" w:cs="Arial"/>
-          <w:sz w:val="20"/>
-          <w:szCs w:val="20"/>
-        </w:rPr>
-        <w:t>▼</w:t>
-      </w:r>
-    </w:p>
-    <w:p>
-      <w:pPr>
-        <w:rPr>
-          <w:sz w:val="20"/>
-          <w:szCs w:val="20"/>
-        </w:rPr>
-      </w:pPr>
-      <w:r>
-        <w:rPr>
-          <w:sz w:val="20"/>
-          <w:szCs w:val="20"/>
-        </w:rPr>
-        <w:t>Argo Rollouts</w:t>
-      </w:r>
-    </w:p>
-    <w:p>
-      <w:pPr>
-        <w:rPr>
-          <w:sz w:val="20"/>
-          <w:szCs w:val="20"/>
-        </w:rPr>
-      </w:pPr>
-      <w:r>
-        <w:rPr>
-          <w:sz w:val="20"/>
-          <w:szCs w:val="20"/>
-        </w:rPr>
-        <w:t xml:space="preserve">        │</w:t>
-      </w:r>
-    </w:p>
-    <w:p>
-      <w:pPr>
-        <w:rPr>
-          <w:rFonts w:ascii="Arial" w:hAnsi="Arial" w:cs="Arial"/>
-          <w:sz w:val="20"/>
-          <w:szCs w:val="20"/>
-        </w:rPr>
-      </w:pPr>
-      <w:r>
-        <w:rPr>
-          <w:sz w:val="20"/>
-          <w:szCs w:val="20"/>
-        </w:rPr>
-        <w:t xml:space="preserve">        </w:t>
-      </w:r>
-      <w:r>
-        <w:rPr>
-          <w:rFonts w:ascii="Arial" w:hAnsi="Arial" w:cs="Arial"/>
-          <w:sz w:val="20"/>
-          <w:szCs w:val="20"/>
-        </w:rPr>
-        <w:t>▼</w:t>
-      </w:r>
-    </w:p>
-    <w:p>
-      <w:pPr>
-        <w:rPr>
-          <w:rFonts w:ascii="Arial" w:hAnsi="Arial" w:cs="Arial"/>
-          <w:sz w:val="20"/>
-          <w:szCs w:val="20"/>
-        </w:rPr>
-      </w:pPr>
-      <w:proofErr w:type="spellStart"/>
+      </w:pPr>
       <w:r>
         <w:rPr>
           <w:sz w:val="20"/>
@@ -1815,7 +1558,6 @@
         </w:rPr>
         <w:t>ReplicaSets</w:t>
       </w:r>
-      <w:proofErr w:type="spellEnd"/>
     </w:p>
     <w:p>
       <w:pPr>
@@ -1925,6 +1667,9 @@
     </w:p>
     <w:p>
       <w:r>
+        <w:rPr>
+          <w:noProof/>
+        </w:rPr>
         <w:lastRenderedPageBreak/>
         <w:drawing>
           <wp:inline distT="0" distB="0" distL="0" distR="0" wp14:anchorId="6571E9C6" wp14:editId="03869274">
@@ -1968,6 +1713,258 @@
     <w:p/>
     <w:p/>
     <w:p/>
+    <w:p/>
+    <w:p>
+      <w:pPr>
+        <w:rPr>
+          <w:b/>
+          <w:bCs/>
+        </w:rPr>
+      </w:pPr>
+      <w:r>
+        <w:rPr>
+          <w:b/>
+          <w:bCs/>
+          <w:highlight w:val="yellow"/>
+        </w:rPr>
+        <w:lastRenderedPageBreak/>
+        <w:t>feat(argocd): implement canary deployments with Argo Rollouts</w:t>
+      </w:r>
+    </w:p>
+    <w:p>
+      <w:r>
+        <w:t xml:space="preserve">                Internet</w:t>
+      </w:r>
+    </w:p>
+    <w:p>
+      <w:r>
+        <w:t xml:space="preserve">                    │</w:t>
+      </w:r>
+    </w:p>
+    <w:p>
+      <w:r>
+        <w:t xml:space="preserve">                    </w:t>
+      </w:r>
+      <w:r>
+        <w:rPr>
+          <w:rFonts w:ascii="Arial" w:hAnsi="Arial" w:cs="Arial"/>
+        </w:rPr>
+        <w:t>▼</w:t>
+      </w:r>
+    </w:p>
+    <w:p>
+      <w:r>
+        <w:t xml:space="preserve">              AWS ALB Ingress</w:t>
+      </w:r>
+    </w:p>
+    <w:p>
+      <w:r>
+        <w:t xml:space="preserve">                    │</w:t>
+      </w:r>
+    </w:p>
+    <w:p>
+      <w:r>
+        <w:t xml:space="preserve">      ┌─────────────</w:t>
+      </w:r>
+      <w:r>
+        <w:rPr>
+          <w:rFonts w:ascii="MS Gothic" w:eastAsia="MS Gothic" w:hAnsi="MS Gothic" w:cs="MS Gothic" w:hint="eastAsia"/>
+        </w:rPr>
+        <w:t>┴</w:t>
+      </w:r>
+      <w:r>
+        <w:rPr>
+          <w:rFonts w:ascii="Aptos" w:hAnsi="Aptos" w:cs="Aptos"/>
+        </w:rPr>
+        <w:t>─────────────┐</w:t>
+      </w:r>
+    </w:p>
+    <w:p>
+      <w:r>
+        <w:t xml:space="preserve">      </w:t>
+      </w:r>
+      <w:r>
+        <w:rPr>
+          <w:rFonts w:ascii="Arial" w:hAnsi="Arial" w:cs="Arial"/>
+        </w:rPr>
+        <w:t>▼</w:t>
+      </w:r>
+      <w:r>
+        <w:t xml:space="preserve">                           </w:t>
+      </w:r>
+      <w:r>
+        <w:rPr>
+          <w:rFonts w:ascii="Arial" w:hAnsi="Arial" w:cs="Arial"/>
+        </w:rPr>
+        <w:t>▼</w:t>
+      </w:r>
+    </w:p>
+    <w:p>
+      <w:r>
+        <w:t>Stable Service              Canary Service</w:t>
+      </w:r>
+    </w:p>
+    <w:p>
+      <w:r>
+        <w:t xml:space="preserve">      │                           │</w:t>
+      </w:r>
+    </w:p>
+    <w:p>
+      <w:r>
+        <w:t>Stable ReplicaSet          Canary ReplicaSet</w:t>
+      </w:r>
+    </w:p>
+    <w:p>
+      <w:r>
+        <w:t xml:space="preserve">      └─────────────</w:t>
+      </w:r>
+      <w:r>
+        <w:rPr>
+          <w:rFonts w:ascii="MS Gothic" w:eastAsia="MS Gothic" w:hAnsi="MS Gothic" w:cs="MS Gothic" w:hint="eastAsia"/>
+        </w:rPr>
+        <w:t>┬</w:t>
+      </w:r>
+      <w:r>
+        <w:rPr>
+          <w:rFonts w:ascii="Aptos" w:hAnsi="Aptos" w:cs="Aptos"/>
+        </w:rPr>
+        <w:t>─────────────┘</w:t>
+      </w:r>
+    </w:p>
+    <w:p>
+      <w:r>
+        <w:t xml:space="preserve">                    </w:t>
+      </w:r>
+      <w:r>
+        <w:rPr>
+          <w:rFonts w:ascii="Arial" w:hAnsi="Arial" w:cs="Arial"/>
+        </w:rPr>
+        <w:t>▼</w:t>
+      </w:r>
+    </w:p>
+    <w:p>
+      <w:r>
+        <w:t xml:space="preserve">                 Rollout</w:t>
+      </w:r>
+    </w:p>
+    <w:p>
+      <w:r>
+        <w:drawing>
+          <wp:inline distT="0" distB="0" distL="0" distR="0" wp14:anchorId="2046A6E3" wp14:editId="6F4F33A4">
+            <wp:extent cx="5943600" cy="3695700"/>
+            <wp:effectExtent l="0" t="0" r="0" b="0"/>
+            <wp:docPr id="60241952" name="Picture 1"/>
+            <wp:cNvGraphicFramePr>
+              <a:graphicFrameLocks xmlns:a="http://schemas.openxmlformats.org/drawingml/2006/main" noChangeAspect="1"/>
+            </wp:cNvGraphicFramePr>
+            <a:graphic xmlns:a="http://schemas.openxmlformats.org/drawingml/2006/main">
+              <a:graphicData uri="http://schemas.openxmlformats.org/drawingml/2006/picture">
+                <pic:pic xmlns:pic="http://schemas.openxmlformats.org/drawingml/2006/picture">
+                  <pic:nvPicPr>
+                    <pic:cNvPr id="60241952" name=""/>
+                    <pic:cNvPicPr/>
+                  </pic:nvPicPr>
+                  <pic:blipFill>
+                    <a:blip r:embed="rId24"/>
+                    <a:stretch>
+                      <a:fillRect/>
+                    </a:stretch>
+                  </pic:blipFill>
+                  <pic:spPr>
+                    <a:xfrm>
+                      <a:off x="0" y="0"/>
+                      <a:ext cx="5943600" cy="3695700"/>
+                    </a:xfrm>
+                    <a:prstGeom prst="rect">
+                      <a:avLst/>
+                    </a:prstGeom>
+                  </pic:spPr>
+                </pic:pic>
+              </a:graphicData>
+            </a:graphic>
+          </wp:inline>
+        </w:drawing>
+      </w:r>
+    </w:p>
+    <w:p/>
+    <w:p>
+      <w:r>
+        <w:drawing>
+          <wp:inline distT="0" distB="0" distL="0" distR="0" wp14:anchorId="511ADEE4" wp14:editId="3B6BF7E8">
+            <wp:extent cx="5943600" cy="3479800"/>
+            <wp:effectExtent l="0" t="0" r="0" b="6350"/>
+            <wp:docPr id="1587697654" name="Picture 1"/>
+            <wp:cNvGraphicFramePr>
+              <a:graphicFrameLocks xmlns:a="http://schemas.openxmlformats.org/drawingml/2006/main" noChangeAspect="1"/>
+            </wp:cNvGraphicFramePr>
+            <a:graphic xmlns:a="http://schemas.openxmlformats.org/drawingml/2006/main">
+              <a:graphicData uri="http://schemas.openxmlformats.org/drawingml/2006/picture">
+                <pic:pic xmlns:pic="http://schemas.openxmlformats.org/drawingml/2006/picture">
+                  <pic:nvPicPr>
+                    <pic:cNvPr id="1587697654" name=""/>
+                    <pic:cNvPicPr/>
+                  </pic:nvPicPr>
+                  <pic:blipFill>
+                    <a:blip r:embed="rId25"/>
+                    <a:stretch>
+                      <a:fillRect/>
+                    </a:stretch>
+                  </pic:blipFill>
+                  <pic:spPr>
+                    <a:xfrm>
+                      <a:off x="0" y="0"/>
+                      <a:ext cx="5943600" cy="3479800"/>
+                    </a:xfrm>
+                    <a:prstGeom prst="rect">
+                      <a:avLst/>
+                    </a:prstGeom>
+                  </pic:spPr>
+                </pic:pic>
+              </a:graphicData>
+            </a:graphic>
+          </wp:inline>
+        </w:drawing>
+      </w:r>
+    </w:p>
+    <w:p>
+      <w:r>
+        <w:drawing>
+          <wp:inline distT="0" distB="0" distL="0" distR="0" wp14:anchorId="0647E400" wp14:editId="05FFF0A4">
+            <wp:extent cx="5943600" cy="1447165"/>
+            <wp:effectExtent l="0" t="0" r="0" b="635"/>
+            <wp:docPr id="21940254" name="Picture 1"/>
+            <wp:cNvGraphicFramePr>
+              <a:graphicFrameLocks xmlns:a="http://schemas.openxmlformats.org/drawingml/2006/main" noChangeAspect="1"/>
+            </wp:cNvGraphicFramePr>
+            <a:graphic xmlns:a="http://schemas.openxmlformats.org/drawingml/2006/main">
+              <a:graphicData uri="http://schemas.openxmlformats.org/drawingml/2006/picture">
+                <pic:pic xmlns:pic="http://schemas.openxmlformats.org/drawingml/2006/picture">
+                  <pic:nvPicPr>
+                    <pic:cNvPr id="21940254" name=""/>
+                    <pic:cNvPicPr/>
+                  </pic:nvPicPr>
+                  <pic:blipFill>
+                    <a:blip r:embed="rId26"/>
+                    <a:stretch>
+                      <a:fillRect/>
+                    </a:stretch>
+                  </pic:blipFill>
+                  <pic:spPr>
+                    <a:xfrm>
+                      <a:off x="0" y="0"/>
+                      <a:ext cx="5943600" cy="1447165"/>
+                    </a:xfrm>
+                    <a:prstGeom prst="rect">
+                      <a:avLst/>
+                    </a:prstGeom>
+                  </pic:spPr>
+                </pic:pic>
+              </a:graphicData>
+            </a:graphic>
+          </wp:inline>
+        </w:drawing>
+      </w:r>
+    </w:p>
     <w:p/>
     <w:sectPr>
       <w:pgSz w:w="12240" w:h="15840"/>
@@ -2582,6 +2579,7 @@
   <w:style w:type="character" w:default="1" w:styleId="DefaultParagraphFont">
     <w:name w:val="Default Paragraph Font"/>
     <w:uiPriority w:val="1"/>
+    <w:semiHidden/>
     <w:unhideWhenUsed/>
   </w:style>
   <w:style w:type="table" w:default="1" w:styleId="TableNormal">

</xml_diff>

<commit_message>
feat(argocd): integrate ALB traffic routing for canary deployments
</commit_message>
<xml_diff>
--- a/docs/usermgmt_ci_cd_screenshots.docx
+++ b/docs/usermgmt_ci_cd_screenshots.docx
@@ -9,12 +9,21 @@
           <w:bCs/>
         </w:rPr>
       </w:pPr>
+      <w:proofErr w:type="spellStart"/>
       <w:r>
         <w:rPr>
           <w:b/>
           <w:bCs/>
         </w:rPr>
-        <w:t>usermgmt ci/cd</w:t>
+        <w:t>usermgmt</w:t>
+      </w:r>
+      <w:proofErr w:type="spellEnd"/>
+      <w:r>
+        <w:rPr>
+          <w:b/>
+          <w:bCs/>
+        </w:rPr>
+        <w:t xml:space="preserve"> ci/cd</w:t>
       </w:r>
       <w:r>
         <w:rPr>
@@ -44,140 +53,184 @@
           <w:b/>
           <w:bCs/>
         </w:rPr>
-        <w:t xml:space="preserve"> GitOps Pipeline</w:t>
-      </w:r>
-    </w:p>
-    <w:p>
-      <w:r>
-        <w:t>Application Repo</w:t>
-      </w:r>
-      <w:r>
-        <w:br/>
-      </w:r>
-      <w:r>
-        <w:rPr>
-          <w:rFonts w:ascii="Segoe UI Emoji" w:hAnsi="Segoe UI Emoji" w:cs="Segoe UI Emoji"/>
-        </w:rPr>
-        <w:t>⬇️</w:t>
-      </w:r>
-    </w:p>
-    <w:p>
-      <w:r>
-        <w:t>Build Image</w:t>
-      </w:r>
-      <w:r>
-        <w:br/>
-      </w:r>
-      <w:r>
-        <w:rPr>
-          <w:rFonts w:ascii="Segoe UI Emoji" w:hAnsi="Segoe UI Emoji" w:cs="Segoe UI Emoji"/>
-        </w:rPr>
-        <w:t>⬇️</w:t>
-      </w:r>
-    </w:p>
-    <w:p>
-      <w:r>
-        <w:t>Push to ECR</w:t>
-      </w:r>
-      <w:r>
-        <w:br/>
-      </w:r>
-      <w:r>
-        <w:rPr>
-          <w:rFonts w:ascii="Segoe UI Emoji" w:hAnsi="Segoe UI Emoji" w:cs="Segoe UI Emoji"/>
-        </w:rPr>
-        <w:t>⬇️</w:t>
-      </w:r>
-    </w:p>
-    <w:p>
-      <w:r>
-        <w:t>Update GitOps repo (values.yaml)</w:t>
-      </w:r>
-      <w:r>
-        <w:br/>
-      </w:r>
-      <w:r>
-        <w:rPr>
-          <w:rFonts w:ascii="Segoe UI Emoji" w:hAnsi="Segoe UI Emoji" w:cs="Segoe UI Emoji"/>
-        </w:rPr>
-        <w:t>⬇️</w:t>
-      </w:r>
-    </w:p>
-    <w:p>
-      <w:r>
-        <w:t>Commit automatically</w:t>
-      </w:r>
-      <w:r>
-        <w:br/>
-      </w:r>
-      <w:r>
-        <w:rPr>
-          <w:rFonts w:ascii="Segoe UI Emoji" w:hAnsi="Segoe UI Emoji" w:cs="Segoe UI Emoji"/>
-        </w:rPr>
-        <w:t>⬇️</w:t>
-      </w:r>
-    </w:p>
-    <w:p>
-      <w:r>
-        <w:t>ArgoCD detects commit</w:t>
-      </w:r>
-      <w:r>
-        <w:br/>
-      </w:r>
-      <w:r>
-        <w:rPr>
-          <w:rFonts w:ascii="Segoe UI Emoji" w:hAnsi="Segoe UI Emoji" w:cs="Segoe UI Emoji"/>
-        </w:rPr>
-        <w:t>⬇️</w:t>
-      </w:r>
-    </w:p>
-    <w:p>
-      <w:r>
-        <w:t>Helm renders manifests</w:t>
-      </w:r>
-      <w:r>
-        <w:br/>
-      </w:r>
-      <w:r>
-        <w:rPr>
-          <w:rFonts w:ascii="Segoe UI Emoji" w:hAnsi="Segoe UI Emoji" w:cs="Segoe UI Emoji"/>
-        </w:rPr>
-        <w:t>⬇️</w:t>
-      </w:r>
-    </w:p>
-    <w:p>
-      <w:r>
-        <w:t>Deployment rolls out</w:t>
-      </w:r>
-      <w:r>
-        <w:br/>
-      </w:r>
-      <w:r>
-        <w:rPr>
-          <w:rFonts w:ascii="Segoe UI Emoji" w:hAnsi="Segoe UI Emoji" w:cs="Segoe UI Emoji"/>
-        </w:rPr>
-        <w:t>⬇️</w:t>
-      </w:r>
-    </w:p>
-    <w:p>
-      <w:r>
-        <w:t>Healthy</w:t>
-      </w:r>
-    </w:p>
-    <w:p>
-      <w:pPr>
+        <w:t xml:space="preserve"> </w:t>
+      </w:r>
+      <w:proofErr w:type="spellStart"/>
+      <w:r>
         <w:rPr>
           <w:b/>
           <w:bCs/>
         </w:rPr>
+        <w:t>GitOps</w:t>
+      </w:r>
+      <w:proofErr w:type="spellEnd"/>
+      <w:r>
+        <w:rPr>
+          <w:b/>
+          <w:bCs/>
+        </w:rPr>
+        <w:t xml:space="preserve"> Pipeline</w:t>
+      </w:r>
+    </w:p>
+    <w:p>
+      <w:r>
+        <w:t>Application Repo</w:t>
+      </w:r>
+      <w:r>
+        <w:br/>
+      </w:r>
+      <w:r>
+        <w:rPr>
+          <w:rFonts w:ascii="Segoe UI Emoji" w:hAnsi="Segoe UI Emoji" w:cs="Segoe UI Emoji"/>
+        </w:rPr>
+        <w:t>⬇️</w:t>
+      </w:r>
+    </w:p>
+    <w:p>
+      <w:r>
+        <w:t>Build Image</w:t>
+      </w:r>
+      <w:r>
+        <w:br/>
+      </w:r>
+      <w:r>
+        <w:rPr>
+          <w:rFonts w:ascii="Segoe UI Emoji" w:hAnsi="Segoe UI Emoji" w:cs="Segoe UI Emoji"/>
+        </w:rPr>
+        <w:t>⬇️</w:t>
+      </w:r>
+    </w:p>
+    <w:p>
+      <w:r>
+        <w:t>Push to ECR</w:t>
+      </w:r>
+      <w:r>
+        <w:br/>
+      </w:r>
+      <w:r>
+        <w:rPr>
+          <w:rFonts w:ascii="Segoe UI Emoji" w:hAnsi="Segoe UI Emoji" w:cs="Segoe UI Emoji"/>
+        </w:rPr>
+        <w:t>⬇️</w:t>
+      </w:r>
+    </w:p>
+    <w:p>
+      <w:r>
+        <w:t xml:space="preserve">Update </w:t>
+      </w:r>
+      <w:proofErr w:type="spellStart"/>
+      <w:r>
+        <w:t>GitOps</w:t>
+      </w:r>
+      <w:proofErr w:type="spellEnd"/>
+      <w:r>
+        <w:t xml:space="preserve"> repo (</w:t>
+      </w:r>
+      <w:proofErr w:type="spellStart"/>
+      <w:proofErr w:type="gramStart"/>
+      <w:r>
+        <w:t>values.yaml</w:t>
+      </w:r>
+      <w:proofErr w:type="spellEnd"/>
+      <w:proofErr w:type="gramEnd"/>
+      <w:r>
+        <w:t>)</w:t>
+      </w:r>
+      <w:r>
+        <w:br/>
+      </w:r>
+      <w:r>
+        <w:rPr>
+          <w:rFonts w:ascii="Segoe UI Emoji" w:hAnsi="Segoe UI Emoji" w:cs="Segoe UI Emoji"/>
+        </w:rPr>
+        <w:t>⬇️</w:t>
+      </w:r>
+    </w:p>
+    <w:p>
+      <w:r>
+        <w:t>Commit automatically</w:t>
+      </w:r>
+      <w:r>
+        <w:br/>
+      </w:r>
+      <w:r>
+        <w:rPr>
+          <w:rFonts w:ascii="Segoe UI Emoji" w:hAnsi="Segoe UI Emoji" w:cs="Segoe UI Emoji"/>
+        </w:rPr>
+        <w:t>⬇️</w:t>
+      </w:r>
+    </w:p>
+    <w:p>
+      <w:proofErr w:type="spellStart"/>
+      <w:r>
+        <w:t>ArgoCD</w:t>
+      </w:r>
+      <w:proofErr w:type="spellEnd"/>
+      <w:r>
+        <w:t xml:space="preserve"> detects commit</w:t>
+      </w:r>
+      <w:r>
+        <w:br/>
+      </w:r>
+      <w:r>
+        <w:rPr>
+          <w:rFonts w:ascii="Segoe UI Emoji" w:hAnsi="Segoe UI Emoji" w:cs="Segoe UI Emoji"/>
+        </w:rPr>
+        <w:t>⬇️</w:t>
+      </w:r>
+    </w:p>
+    <w:p>
+      <w:r>
+        <w:t>Helm renders manifests</w:t>
+      </w:r>
+      <w:r>
+        <w:br/>
+      </w:r>
+      <w:r>
+        <w:rPr>
+          <w:rFonts w:ascii="Segoe UI Emoji" w:hAnsi="Segoe UI Emoji" w:cs="Segoe UI Emoji"/>
+        </w:rPr>
+        <w:t>⬇️</w:t>
+      </w:r>
+    </w:p>
+    <w:p>
+      <w:r>
+        <w:t>Deployment rolls out</w:t>
+      </w:r>
+      <w:r>
+        <w:br/>
+      </w:r>
+      <w:r>
+        <w:rPr>
+          <w:rFonts w:ascii="Segoe UI Emoji" w:hAnsi="Segoe UI Emoji" w:cs="Segoe UI Emoji"/>
+        </w:rPr>
+        <w:t>⬇️</w:t>
+      </w:r>
+    </w:p>
+    <w:p>
+      <w:r>
+        <w:t>Healthy</w:t>
+      </w:r>
+    </w:p>
+    <w:p>
+      <w:pPr>
+        <w:rPr>
+          <w:b/>
+          <w:bCs/>
+        </w:rPr>
       </w:pPr>
     </w:p>
     <w:p>
       <w:r>
         <w:t xml:space="preserve">1. </w:t>
       </w:r>
-      <w:r>
-        <w:t xml:space="preserve">ArgoCD </w:t>
+      <w:proofErr w:type="spellStart"/>
+      <w:r>
+        <w:t>ArgoCD</w:t>
+      </w:r>
+      <w:proofErr w:type="spellEnd"/>
+      <w:r>
+        <w:t xml:space="preserve"> </w:t>
       </w:r>
       <w:r>
         <w:t>controller</w:t>
@@ -288,7 +341,35 @@
         <w:rPr>
           <w:highlight w:val="yellow"/>
         </w:rPr>
-        <w:t>Get argocd ui default admin password and change it.</w:t>
+        <w:t xml:space="preserve">Get </w:t>
+      </w:r>
+      <w:proofErr w:type="spellStart"/>
+      <w:r>
+        <w:rPr>
+          <w:highlight w:val="yellow"/>
+        </w:rPr>
+        <w:t>argocd</w:t>
+      </w:r>
+      <w:proofErr w:type="spellEnd"/>
+      <w:r>
+        <w:rPr>
+          <w:highlight w:val="yellow"/>
+        </w:rPr>
+        <w:t xml:space="preserve"> </w:t>
+      </w:r>
+      <w:proofErr w:type="spellStart"/>
+      <w:r>
+        <w:rPr>
+          <w:highlight w:val="yellow"/>
+        </w:rPr>
+        <w:t>ui</w:t>
+      </w:r>
+      <w:proofErr w:type="spellEnd"/>
+      <w:r>
+        <w:rPr>
+          <w:highlight w:val="yellow"/>
+        </w:rPr>
+        <w:t xml:space="preserve"> default admin password and change it.</w:t>
       </w:r>
       <w:r>
         <w:t xml:space="preserve"> </w:t>
@@ -339,7 +420,49 @@
         <w:rPr>
           <w:highlight w:val="yellow"/>
         </w:rPr>
-        <w:t>Route53 with argocd and usermgmt service dns records</w:t>
+        <w:t xml:space="preserve">Route53 with </w:t>
+      </w:r>
+      <w:proofErr w:type="spellStart"/>
+      <w:r>
+        <w:rPr>
+          <w:highlight w:val="yellow"/>
+        </w:rPr>
+        <w:t>argocd</w:t>
+      </w:r>
+      <w:proofErr w:type="spellEnd"/>
+      <w:r>
+        <w:rPr>
+          <w:highlight w:val="yellow"/>
+        </w:rPr>
+        <w:t xml:space="preserve"> and </w:t>
+      </w:r>
+      <w:proofErr w:type="spellStart"/>
+      <w:r>
+        <w:rPr>
+          <w:highlight w:val="yellow"/>
+        </w:rPr>
+        <w:t>usermgmt</w:t>
+      </w:r>
+      <w:proofErr w:type="spellEnd"/>
+      <w:r>
+        <w:rPr>
+          <w:highlight w:val="yellow"/>
+        </w:rPr>
+        <w:t xml:space="preserve"> service </w:t>
+      </w:r>
+      <w:proofErr w:type="spellStart"/>
+      <w:r>
+        <w:rPr>
+          <w:highlight w:val="yellow"/>
+        </w:rPr>
+        <w:t>dns</w:t>
+      </w:r>
+      <w:proofErr w:type="spellEnd"/>
+      <w:r>
+        <w:rPr>
+          <w:highlight w:val="yellow"/>
+        </w:rPr>
+        <w:t xml:space="preserve"> records</w:t>
       </w:r>
     </w:p>
     <w:p>
@@ -385,12 +508,48 @@
       </w:r>
     </w:p>
     <w:p>
+      <w:proofErr w:type="spellStart"/>
       <w:r>
         <w:rPr>
           <w:highlight w:val="yellow"/>
         </w:rPr>
         <w:lastRenderedPageBreak/>
-        <w:t>ArgoCD ui (applications have not yet been deployed by ArgoCD)</w:t>
+        <w:t>ArgoCD</w:t>
+      </w:r>
+      <w:proofErr w:type="spellEnd"/>
+      <w:r>
+        <w:rPr>
+          <w:highlight w:val="yellow"/>
+        </w:rPr>
+        <w:t xml:space="preserve"> </w:t>
+      </w:r>
+      <w:proofErr w:type="spellStart"/>
+      <w:r>
+        <w:rPr>
+          <w:highlight w:val="yellow"/>
+        </w:rPr>
+        <w:t>ui</w:t>
+      </w:r>
+      <w:proofErr w:type="spellEnd"/>
+      <w:r>
+        <w:rPr>
+          <w:highlight w:val="yellow"/>
+        </w:rPr>
+        <w:t xml:space="preserve"> (applications have not yet been deployed by </w:t>
+      </w:r>
+      <w:proofErr w:type="spellStart"/>
+      <w:r>
+        <w:rPr>
+          <w:highlight w:val="yellow"/>
+        </w:rPr>
+        <w:t>ArgoCD</w:t>
+      </w:r>
+      <w:proofErr w:type="spellEnd"/>
+      <w:r>
+        <w:rPr>
+          <w:highlight w:val="yellow"/>
+        </w:rPr>
+        <w:t>)</w:t>
       </w:r>
     </w:p>
     <w:p>
@@ -548,12 +707,20 @@
     <w:p/>
     <w:p/>
     <w:p>
+      <w:proofErr w:type="spellStart"/>
       <w:r>
         <w:rPr>
           <w:highlight w:val="yellow"/>
         </w:rPr>
         <w:lastRenderedPageBreak/>
-        <w:t>GitOps CI/CD succeeded with commit tag</w:t>
+        <w:t>GitOps</w:t>
+      </w:r>
+      <w:proofErr w:type="spellEnd"/>
+      <w:r>
+        <w:rPr>
+          <w:highlight w:val="yellow"/>
+        </w:rPr>
+        <w:t xml:space="preserve"> CI/CD succeeded with commit tag</w:t>
       </w:r>
     </w:p>
     <w:p>
@@ -649,8 +816,13 @@
       </w:r>
     </w:p>
     <w:p>
-      <w:r>
-        <w:t xml:space="preserve">GitOps repo updated with latest </w:t>
+      <w:proofErr w:type="spellStart"/>
+      <w:r>
+        <w:t>GitOps</w:t>
+      </w:r>
+      <w:proofErr w:type="spellEnd"/>
+      <w:r>
+        <w:t xml:space="preserve"> repo updated with latest </w:t>
       </w:r>
       <w:r>
         <w:t>image</w:t>
@@ -703,8 +875,13 @@
       </w:r>
     </w:p>
     <w:p>
-      <w:r>
-        <w:t>ArgoCD healthy and in sync with the live state of the EKS cluster.</w:t>
+      <w:proofErr w:type="spellStart"/>
+      <w:r>
+        <w:t>ArgoCD</w:t>
+      </w:r>
+      <w:proofErr w:type="spellEnd"/>
+      <w:r>
+        <w:t xml:space="preserve"> healthy and in sync with the live state of the EKS cluster.</w:t>
       </w:r>
     </w:p>
     <w:p>
@@ -892,6 +1069,7 @@
           <w:bCs/>
         </w:rPr>
       </w:pPr>
+      <w:proofErr w:type="spellStart"/>
       <w:r>
         <w:rPr>
           <w:b/>
@@ -900,6 +1078,7 @@
         </w:rPr>
         <w:t>adot_metrics</w:t>
       </w:r>
+      <w:proofErr w:type="spellEnd"/>
       <w:r>
         <w:rPr>
           <w:b/>
@@ -911,7 +1090,15 @@
     </w:p>
     <w:p>
       <w:r>
-        <w:t>- deploy OpenTelemetry metrics collector</w:t>
+        <w:t xml:space="preserve">- deploy </w:t>
+      </w:r>
+      <w:proofErr w:type="spellStart"/>
+      <w:r>
+        <w:t>OpenTelemetry</w:t>
+      </w:r>
+      <w:proofErr w:type="spellEnd"/>
+      <w:r>
+        <w:t xml:space="preserve"> metrics collector</w:t>
       </w:r>
     </w:p>
     <w:p>
@@ -921,8 +1108,13 @@
     </w:p>
     <w:p>
       <w:r>
-        <w:t>- integrate Amazon Managed Grafana datasource</w:t>
-      </w:r>
+        <w:t xml:space="preserve">- integrate Amazon Managed Grafana </w:t>
+      </w:r>
+      <w:proofErr w:type="spellStart"/>
+      <w:r>
+        <w:t>datasource</w:t>
+      </w:r>
+      <w:proofErr w:type="spellEnd"/>
     </w:p>
     <w:p>
       <w:r>
@@ -1035,13 +1227,41 @@
         <w:rPr>
           <w:highlight w:val="yellow"/>
         </w:rPr>
-        <w:t xml:space="preserve">/Prometheus </w:t>
-      </w:r>
-      <w:r>
-        <w:rPr>
-          <w:highlight w:val="yellow"/>
-        </w:rPr>
-        <w:t xml:space="preserve"> dashboard for usermgmt service</w:t>
+        <w:t>/</w:t>
+      </w:r>
+      <w:proofErr w:type="gramStart"/>
+      <w:r>
+        <w:rPr>
+          <w:highlight w:val="yellow"/>
+        </w:rPr>
+        <w:t xml:space="preserve">Prometheus </w:t>
+      </w:r>
+      <w:r>
+        <w:rPr>
+          <w:highlight w:val="yellow"/>
+        </w:rPr>
+        <w:t xml:space="preserve"> dashboard</w:t>
+      </w:r>
+      <w:proofErr w:type="gramEnd"/>
+      <w:r>
+        <w:rPr>
+          <w:highlight w:val="yellow"/>
+        </w:rPr>
+        <w:t xml:space="preserve"> for </w:t>
+      </w:r>
+      <w:proofErr w:type="spellStart"/>
+      <w:r>
+        <w:rPr>
+          <w:highlight w:val="yellow"/>
+        </w:rPr>
+        <w:t>usermgmt</w:t>
+      </w:r>
+      <w:proofErr w:type="spellEnd"/>
+      <w:r>
+        <w:rPr>
+          <w:highlight w:val="yellow"/>
+        </w:rPr>
+        <w:t xml:space="preserve"> service</w:t>
       </w:r>
     </w:p>
     <w:p>
@@ -1147,7 +1367,29 @@
             <w:sz w:val="20"/>
             <w:szCs w:val="20"/>
           </w:rPr>
-          <w:t>feat(platform): migrate User Management to Argo Rollouts</w:t>
+          <w:t xml:space="preserve">feat(platform): </w:t>
+        </w:r>
+        <w:proofErr w:type="gramStart"/>
+        <w:r>
+          <w:rPr>
+            <w:rStyle w:val="Hyperlink"/>
+            <w:b/>
+            <w:bCs/>
+            <w:sz w:val="20"/>
+            <w:szCs w:val="20"/>
+          </w:rPr>
+          <w:t>migrate</w:t>
+        </w:r>
+        <w:proofErr w:type="gramEnd"/>
+        <w:r>
+          <w:rPr>
+            <w:rStyle w:val="Hyperlink"/>
+            <w:b/>
+            <w:bCs/>
+            <w:sz w:val="20"/>
+            <w:szCs w:val="20"/>
+          </w:rPr>
+          <w:t xml:space="preserve"> User Management to Argo Rollouts</w:t>
         </w:r>
       </w:hyperlink>
     </w:p>
@@ -1160,6 +1402,7 @@
           <w:szCs w:val="20"/>
         </w:rPr>
       </w:pPr>
+      <w:proofErr w:type="spellStart"/>
       <w:r>
         <w:rPr>
           <w:b/>
@@ -1168,7 +1411,18 @@
           <w:szCs w:val="20"/>
           <w:highlight w:val="yellow"/>
         </w:rPr>
-        <w:t>ArgoCD Rollouts-Canary</w:t>
+        <w:t>ArgoCD</w:t>
+      </w:r>
+      <w:proofErr w:type="spellEnd"/>
+      <w:r>
+        <w:rPr>
+          <w:b/>
+          <w:bCs/>
+          <w:sz w:val="20"/>
+          <w:szCs w:val="20"/>
+          <w:highlight w:val="yellow"/>
+        </w:rPr>
+        <w:t xml:space="preserve"> Rollouts-Canary</w:t>
       </w:r>
     </w:p>
     <w:p>
@@ -1443,6 +1697,7 @@
           <w:szCs w:val="20"/>
         </w:rPr>
       </w:pPr>
+      <w:proofErr w:type="spellStart"/>
       <w:r>
         <w:rPr>
           <w:sz w:val="20"/>
@@ -1450,6 +1705,7 @@
         </w:rPr>
         <w:t>ArgoCD</w:t>
       </w:r>
+      <w:proofErr w:type="spellEnd"/>
     </w:p>
     <w:p>
       <w:pPr>
@@ -1551,6 +1807,7 @@
           <w:szCs w:val="20"/>
         </w:rPr>
       </w:pPr>
+      <w:proofErr w:type="spellStart"/>
       <w:r>
         <w:rPr>
           <w:sz w:val="20"/>
@@ -1558,6 +1815,7 @@
         </w:rPr>
         <w:t>ReplicaSets</w:t>
       </w:r>
+      <w:proofErr w:type="spellEnd"/>
     </w:p>
     <w:p>
       <w:pPr>
@@ -1728,7 +1986,25 @@
           <w:highlight w:val="yellow"/>
         </w:rPr>
         <w:lastRenderedPageBreak/>
-        <w:t>feat(argocd): implement canary deployments with Argo Rollouts</w:t>
+        <w:t>feat(</w:t>
+      </w:r>
+      <w:proofErr w:type="spellStart"/>
+      <w:r>
+        <w:rPr>
+          <w:b/>
+          <w:bCs/>
+          <w:highlight w:val="yellow"/>
+        </w:rPr>
+        <w:t>argocd</w:t>
+      </w:r>
+      <w:proofErr w:type="spellEnd"/>
+      <w:r>
+        <w:rPr>
+          <w:b/>
+          <w:bCs/>
+          <w:highlight w:val="yellow"/>
+        </w:rPr>
+        <w:t>): implement canary deployments with Argo Rollouts</w:t>
       </w:r>
     </w:p>
     <w:p>
@@ -1811,8 +2087,21 @@
     </w:p>
     <w:p>
       <w:r>
-        <w:t>Stable ReplicaSet          Canary ReplicaSet</w:t>
-      </w:r>
+        <w:t xml:space="preserve">Stable </w:t>
+      </w:r>
+      <w:proofErr w:type="spellStart"/>
+      <w:r>
+        <w:t>ReplicaSet</w:t>
+      </w:r>
+      <w:proofErr w:type="spellEnd"/>
+      <w:r>
+        <w:t xml:space="preserve">          Canary </w:t>
+      </w:r>
+      <w:proofErr w:type="spellStart"/>
+      <w:r>
+        <w:t>ReplicaSet</w:t>
+      </w:r>
+      <w:proofErr w:type="spellEnd"/>
     </w:p>
     <w:p>
       <w:r>
@@ -1849,6 +2138,9 @@
     </w:p>
     <w:p>
       <w:r>
+        <w:rPr>
+          <w:noProof/>
+        </w:rPr>
         <w:drawing>
           <wp:inline distT="0" distB="0" distL="0" distR="0" wp14:anchorId="2046A6E3" wp14:editId="6F4F33A4">
             <wp:extent cx="5943600" cy="3695700"/>
@@ -1889,6 +2181,9 @@
     <w:p/>
     <w:p>
       <w:r>
+        <w:rPr>
+          <w:noProof/>
+        </w:rPr>
         <w:drawing>
           <wp:inline distT="0" distB="0" distL="0" distR="0" wp14:anchorId="511ADEE4" wp14:editId="3B6BF7E8">
             <wp:extent cx="5943600" cy="3479800"/>
@@ -1928,6 +2223,9 @@
     </w:p>
     <w:p>
       <w:r>
+        <w:rPr>
+          <w:noProof/>
+        </w:rPr>
         <w:drawing>
           <wp:inline distT="0" distB="0" distL="0" distR="0" wp14:anchorId="0647E400" wp14:editId="05FFF0A4">
             <wp:extent cx="5943600" cy="1447165"/>
@@ -1965,6 +2263,7 @@
         </w:drawing>
       </w:r>
     </w:p>
+    <w:p/>
     <w:p/>
     <w:sectPr>
       <w:pgSz w:w="12240" w:h="15840"/>

</xml_diff>

<commit_message>
feat(argocd): enable AWS ALB traffic routing for progressive canary deployments
</commit_message>
<xml_diff>
--- a/docs/usermgmt_ci_cd_screenshots.docx
+++ b/docs/usermgmt_ci_cd_screenshots.docx
@@ -2251,6 +2251,116 @@
                     <a:xfrm>
                       <a:off x="0" y="0"/>
                       <a:ext cx="5943600" cy="1447165"/>
+                    </a:xfrm>
+                    <a:prstGeom prst="rect">
+                      <a:avLst/>
+                    </a:prstGeom>
+                  </pic:spPr>
+                </pic:pic>
+              </a:graphicData>
+            </a:graphic>
+          </wp:inline>
+        </w:drawing>
+      </w:r>
+    </w:p>
+    <w:p/>
+    <w:p/>
+    <w:p/>
+    <w:p/>
+    <w:p/>
+    <w:p/>
+    <w:p/>
+    <w:p/>
+    <w:p>
+      <w:r>
+        <w:rPr>
+          <w:highlight w:val="yellow"/>
+        </w:rPr>
+        <w:lastRenderedPageBreak/>
+        <w:t>feat(</w:t>
+      </w:r>
+      <w:proofErr w:type="spellStart"/>
+      <w:r>
+        <w:rPr>
+          <w:highlight w:val="yellow"/>
+        </w:rPr>
+        <w:t>argocd</w:t>
+      </w:r>
+      <w:proofErr w:type="spellEnd"/>
+      <w:r>
+        <w:rPr>
+          <w:highlight w:val="yellow"/>
+        </w:rPr>
+        <w:t>): enable AWS ALB traffic routing for progressive canary deployments</w:t>
+      </w:r>
+    </w:p>
+    <w:p>
+      <w:r>
+        <w:drawing>
+          <wp:inline distT="0" distB="0" distL="0" distR="0" wp14:anchorId="025D3986" wp14:editId="14405C70">
+            <wp:extent cx="5943600" cy="4877435"/>
+            <wp:effectExtent l="0" t="0" r="0" b="0"/>
+            <wp:docPr id="148083173" name="Picture 1"/>
+            <wp:cNvGraphicFramePr>
+              <a:graphicFrameLocks xmlns:a="http://schemas.openxmlformats.org/drawingml/2006/main" noChangeAspect="1"/>
+            </wp:cNvGraphicFramePr>
+            <a:graphic xmlns:a="http://schemas.openxmlformats.org/drawingml/2006/main">
+              <a:graphicData uri="http://schemas.openxmlformats.org/drawingml/2006/picture">
+                <pic:pic xmlns:pic="http://schemas.openxmlformats.org/drawingml/2006/picture">
+                  <pic:nvPicPr>
+                    <pic:cNvPr id="148083173" name=""/>
+                    <pic:cNvPicPr/>
+                  </pic:nvPicPr>
+                  <pic:blipFill>
+                    <a:blip r:embed="rId27"/>
+                    <a:stretch>
+                      <a:fillRect/>
+                    </a:stretch>
+                  </pic:blipFill>
+                  <pic:spPr>
+                    <a:xfrm>
+                      <a:off x="0" y="0"/>
+                      <a:ext cx="5943600" cy="4877435"/>
+                    </a:xfrm>
+                    <a:prstGeom prst="rect">
+                      <a:avLst/>
+                    </a:prstGeom>
+                  </pic:spPr>
+                </pic:pic>
+              </a:graphicData>
+            </a:graphic>
+          </wp:inline>
+        </w:drawing>
+      </w:r>
+    </w:p>
+    <w:p>
+      <w:r>
+        <w:lastRenderedPageBreak/>
+        <w:drawing>
+          <wp:inline distT="0" distB="0" distL="0" distR="0" wp14:anchorId="347FD01A" wp14:editId="1687D23C">
+            <wp:extent cx="5943600" cy="4427855"/>
+            <wp:effectExtent l="0" t="0" r="0" b="0"/>
+            <wp:docPr id="2079454045" name="Picture 1"/>
+            <wp:cNvGraphicFramePr>
+              <a:graphicFrameLocks xmlns:a="http://schemas.openxmlformats.org/drawingml/2006/main" noChangeAspect="1"/>
+            </wp:cNvGraphicFramePr>
+            <a:graphic xmlns:a="http://schemas.openxmlformats.org/drawingml/2006/main">
+              <a:graphicData uri="http://schemas.openxmlformats.org/drawingml/2006/picture">
+                <pic:pic xmlns:pic="http://schemas.openxmlformats.org/drawingml/2006/picture">
+                  <pic:nvPicPr>
+                    <pic:cNvPr id="2079454045" name=""/>
+                    <pic:cNvPicPr/>
+                  </pic:nvPicPr>
+                  <pic:blipFill>
+                    <a:blip r:embed="rId28"/>
+                    <a:stretch>
+                      <a:fillRect/>
+                    </a:stretch>
+                  </pic:blipFill>
+                  <pic:spPr>
+                    <a:xfrm>
+                      <a:off x="0" y="0"/>
+                      <a:ext cx="5943600" cy="4427855"/>
                     </a:xfrm>
                     <a:prstGeom prst="rect">
                       <a:avLst/>

</xml_diff>

<commit_message>
feat(argocd): implement blue-green deployment strategy
</commit_message>
<xml_diff>
--- a/docs/usermgmt_ci_cd_screenshots.docx
+++ b/docs/usermgmt_ci_cd_screenshots.docx
@@ -127,12 +127,10 @@
         <w:t xml:space="preserve"> repo (</w:t>
       </w:r>
       <w:proofErr w:type="spellStart"/>
-      <w:proofErr w:type="gramStart"/>
       <w:r>
         <w:t>values.yaml</w:t>
       </w:r>
       <w:proofErr w:type="spellEnd"/>
-      <w:proofErr w:type="gramEnd"/>
       <w:r>
         <w:t>)</w:t>
       </w:r>
@@ -1227,27 +1225,13 @@
         <w:rPr>
           <w:highlight w:val="yellow"/>
         </w:rPr>
-        <w:t>/</w:t>
-      </w:r>
-      <w:proofErr w:type="gramStart"/>
-      <w:r>
-        <w:rPr>
-          <w:highlight w:val="yellow"/>
-        </w:rPr>
-        <w:t xml:space="preserve">Prometheus </w:t>
-      </w:r>
-      <w:r>
-        <w:rPr>
-          <w:highlight w:val="yellow"/>
-        </w:rPr>
-        <w:t xml:space="preserve"> dashboard</w:t>
-      </w:r>
-      <w:proofErr w:type="gramEnd"/>
-      <w:r>
-        <w:rPr>
-          <w:highlight w:val="yellow"/>
-        </w:rPr>
-        <w:t xml:space="preserve"> for </w:t>
+        <w:t xml:space="preserve">/Prometheus </w:t>
+      </w:r>
+      <w:r>
+        <w:rPr>
+          <w:highlight w:val="yellow"/>
+        </w:rPr>
+        <w:t xml:space="preserve"> dashboard for </w:t>
       </w:r>
       <w:proofErr w:type="spellStart"/>
       <w:r>
@@ -1367,29 +1351,7 @@
             <w:sz w:val="20"/>
             <w:szCs w:val="20"/>
           </w:rPr>
-          <w:t xml:space="preserve">feat(platform): </w:t>
-        </w:r>
-        <w:proofErr w:type="gramStart"/>
-        <w:r>
-          <w:rPr>
-            <w:rStyle w:val="Hyperlink"/>
-            <w:b/>
-            <w:bCs/>
-            <w:sz w:val="20"/>
-            <w:szCs w:val="20"/>
-          </w:rPr>
-          <w:t>migrate</w:t>
-        </w:r>
-        <w:proofErr w:type="gramEnd"/>
-        <w:r>
-          <w:rPr>
-            <w:rStyle w:val="Hyperlink"/>
-            <w:b/>
-            <w:bCs/>
-            <w:sz w:val="20"/>
-            <w:szCs w:val="20"/>
-          </w:rPr>
-          <w:t xml:space="preserve"> User Management to Argo Rollouts</w:t>
+          <w:t>feat(platform): migrate User Management to Argo Rollouts</w:t>
         </w:r>
       </w:hyperlink>
     </w:p>
@@ -2296,6 +2258,9 @@
     </w:p>
     <w:p>
       <w:r>
+        <w:rPr>
+          <w:noProof/>
+        </w:rPr>
         <w:drawing>
           <wp:inline distT="0" distB="0" distL="0" distR="0" wp14:anchorId="025D3986" wp14:editId="14405C70">
             <wp:extent cx="5943600" cy="4877435"/>
@@ -2335,6 +2300,9 @@
     </w:p>
     <w:p>
       <w:r>
+        <w:rPr>
+          <w:noProof/>
+        </w:rPr>
         <w:lastRenderedPageBreak/>
         <w:drawing>
           <wp:inline distT="0" distB="0" distL="0" distR="0" wp14:anchorId="347FD01A" wp14:editId="1687D23C">
@@ -2374,7 +2342,22 @@
       </w:r>
     </w:p>
     <w:p/>
-    <w:p/>
+    <w:p>
+      <w:pPr>
+        <w:rPr>
+          <w:sz w:val="18"/>
+          <w:szCs w:val="18"/>
+        </w:rPr>
+      </w:pPr>
+    </w:p>
+    <w:p>
+      <w:pPr>
+        <w:rPr>
+          <w:sz w:val="18"/>
+          <w:szCs w:val="18"/>
+        </w:rPr>
+      </w:pPr>
+    </w:p>
     <w:sectPr>
       <w:pgSz w:w="12240" w:h="15840"/>
       <w:pgMar w:top="1440" w:right="1440" w:bottom="1440" w:left="1440" w:header="720" w:footer="720" w:gutter="0"/>

</xml_diff>